<commit_message>
Did some small format changes
</commit_message>
<xml_diff>
--- a/Week_2/Student_Information_System_Requirements.docx
+++ b/Week_2/Student_Information_System_Requirements.docx
@@ -424,7 +424,7 @@
     </w:p>
     <w:p>
       <w:pPr>
-        <w:pStyle w:val="726"/>
+        <w:pStyle w:val="919"/>
         <w:pBdr/>
         <w:spacing w:after="120" w:before="360"/>
         <w:ind/>
@@ -509,7 +509,7 @@
     </w:p>
     <w:p>
       <w:pPr>
-        <w:pStyle w:val="727"/>
+        <w:pStyle w:val="920"/>
         <w:pBdr/>
         <w:spacing w:after="80" w:before="240"/>
         <w:ind/>
@@ -547,7 +547,7 @@
     </w:p>
     <w:p>
       <w:pPr>
-        <w:pStyle w:val="721"/>
+        <w:pStyle w:val="914"/>
         <w:numPr>
           <w:ilvl w:val="0"/>
           <w:numId w:val="2"/>
@@ -569,7 +569,7 @@
     </w:p>
     <w:p>
       <w:pPr>
-        <w:pStyle w:val="721"/>
+        <w:pStyle w:val="914"/>
         <w:numPr>
           <w:ilvl w:val="0"/>
           <w:numId w:val="2"/>
@@ -591,7 +591,7 @@
     </w:p>
     <w:p>
       <w:pPr>
-        <w:pStyle w:val="721"/>
+        <w:pStyle w:val="914"/>
         <w:numPr>
           <w:ilvl w:val="0"/>
           <w:numId w:val="2"/>
@@ -613,7 +613,7 @@
     </w:p>
     <w:p>
       <w:pPr>
-        <w:pStyle w:val="721"/>
+        <w:pStyle w:val="914"/>
         <w:numPr>
           <w:ilvl w:val="0"/>
           <w:numId w:val="2"/>
@@ -635,7 +635,7 @@
     </w:p>
     <w:p>
       <w:pPr>
-        <w:pStyle w:val="721"/>
+        <w:pStyle w:val="914"/>
         <w:numPr>
           <w:ilvl w:val="0"/>
           <w:numId w:val="2"/>
@@ -657,7 +657,7 @@
     </w:p>
     <w:p>
       <w:pPr>
-        <w:pStyle w:val="721"/>
+        <w:pStyle w:val="914"/>
         <w:numPr>
           <w:ilvl w:val="0"/>
           <w:numId w:val="2"/>
@@ -691,7 +691,7 @@
     </w:p>
     <w:p>
       <w:pPr>
-        <w:pStyle w:val="726"/>
+        <w:pStyle w:val="919"/>
         <w:pBdr/>
         <w:spacing w:after="120" w:before="360"/>
         <w:ind/>
@@ -724,7 +724,7 @@
     </w:p>
     <w:p>
       <w:pPr>
-        <w:pStyle w:val="727"/>
+        <w:pStyle w:val="920"/>
         <w:pBdr/>
         <w:spacing w:after="80" w:before="240"/>
         <w:ind/>
@@ -782,7 +782,7 @@
     </w:p>
     <w:p>
       <w:pPr>
-        <w:pStyle w:val="721"/>
+        <w:pStyle w:val="914"/>
         <w:numPr>
           <w:ilvl w:val="0"/>
           <w:numId w:val="2"/>
@@ -804,7 +804,7 @@
     </w:p>
     <w:p>
       <w:pPr>
-        <w:pStyle w:val="721"/>
+        <w:pStyle w:val="914"/>
         <w:numPr>
           <w:ilvl w:val="0"/>
           <w:numId w:val="2"/>
@@ -826,7 +826,7 @@
     </w:p>
     <w:p>
       <w:pPr>
-        <w:pStyle w:val="721"/>
+        <w:pStyle w:val="914"/>
         <w:numPr>
           <w:ilvl w:val="0"/>
           <w:numId w:val="2"/>
@@ -848,7 +848,7 @@
     </w:p>
     <w:p>
       <w:pPr>
-        <w:pStyle w:val="721"/>
+        <w:pStyle w:val="914"/>
         <w:numPr>
           <w:ilvl w:val="0"/>
           <w:numId w:val="2"/>
@@ -870,7 +870,7 @@
     </w:p>
     <w:p>
       <w:pPr>
-        <w:pStyle w:val="721"/>
+        <w:pStyle w:val="914"/>
         <w:numPr>
           <w:ilvl w:val="0"/>
           <w:numId w:val="2"/>
@@ -892,7 +892,7 @@
     </w:p>
     <w:p>
       <w:pPr>
-        <w:pStyle w:val="721"/>
+        <w:pStyle w:val="914"/>
         <w:numPr>
           <w:ilvl w:val="0"/>
           <w:numId w:val="2"/>
@@ -914,7 +914,7 @@
     </w:p>
     <w:p>
       <w:pPr>
-        <w:pStyle w:val="721"/>
+        <w:pStyle w:val="914"/>
         <w:numPr>
           <w:ilvl w:val="0"/>
           <w:numId w:val="2"/>
@@ -946,7 +946,7 @@
     </w:p>
     <w:p>
       <w:pPr>
-        <w:pStyle w:val="727"/>
+        <w:pStyle w:val="920"/>
         <w:pBdr/>
         <w:spacing w:after="80" w:before="240"/>
         <w:ind/>
@@ -1004,7 +1004,7 @@
     </w:p>
     <w:p>
       <w:pPr>
-        <w:pStyle w:val="721"/>
+        <w:pStyle w:val="914"/>
         <w:numPr>
           <w:ilvl w:val="0"/>
           <w:numId w:val="2"/>
@@ -1026,7 +1026,7 @@
     </w:p>
     <w:p>
       <w:pPr>
-        <w:pStyle w:val="721"/>
+        <w:pStyle w:val="914"/>
         <w:numPr>
           <w:ilvl w:val="0"/>
           <w:numId w:val="2"/>
@@ -1048,7 +1048,7 @@
     </w:p>
     <w:p>
       <w:pPr>
-        <w:pStyle w:val="721"/>
+        <w:pStyle w:val="914"/>
         <w:numPr>
           <w:ilvl w:val="0"/>
           <w:numId w:val="2"/>
@@ -1070,7 +1070,7 @@
     </w:p>
     <w:p>
       <w:pPr>
-        <w:pStyle w:val="721"/>
+        <w:pStyle w:val="914"/>
         <w:numPr>
           <w:ilvl w:val="0"/>
           <w:numId w:val="2"/>
@@ -1092,7 +1092,7 @@
     </w:p>
     <w:p>
       <w:pPr>
-        <w:pStyle w:val="721"/>
+        <w:pStyle w:val="914"/>
         <w:numPr>
           <w:ilvl w:val="0"/>
           <w:numId w:val="2"/>
@@ -1114,7 +1114,7 @@
     </w:p>
     <w:p>
       <w:pPr>
-        <w:pStyle w:val="721"/>
+        <w:pStyle w:val="914"/>
         <w:numPr>
           <w:ilvl w:val="0"/>
           <w:numId w:val="2"/>
@@ -1136,7 +1136,7 @@
     </w:p>
     <w:p>
       <w:pPr>
-        <w:pStyle w:val="721"/>
+        <w:pStyle w:val="914"/>
         <w:numPr>
           <w:ilvl w:val="0"/>
           <w:numId w:val="2"/>
@@ -1168,7 +1168,7 @@
     </w:p>
     <w:p>
       <w:pPr>
-        <w:pStyle w:val="727"/>
+        <w:pStyle w:val="920"/>
         <w:pBdr/>
         <w:spacing w:after="80" w:before="240"/>
         <w:ind/>
@@ -1226,7 +1226,7 @@
     </w:p>
     <w:p>
       <w:pPr>
-        <w:pStyle w:val="721"/>
+        <w:pStyle w:val="914"/>
         <w:numPr>
           <w:ilvl w:val="0"/>
           <w:numId w:val="2"/>
@@ -1248,7 +1248,7 @@
     </w:p>
     <w:p>
       <w:pPr>
-        <w:pStyle w:val="721"/>
+        <w:pStyle w:val="914"/>
         <w:numPr>
           <w:ilvl w:val="0"/>
           <w:numId w:val="2"/>
@@ -1270,7 +1270,7 @@
     </w:p>
     <w:p>
       <w:pPr>
-        <w:pStyle w:val="721"/>
+        <w:pStyle w:val="914"/>
         <w:numPr>
           <w:ilvl w:val="0"/>
           <w:numId w:val="2"/>
@@ -1292,7 +1292,7 @@
     </w:p>
     <w:p>
       <w:pPr>
-        <w:pStyle w:val="721"/>
+        <w:pStyle w:val="914"/>
         <w:numPr>
           <w:ilvl w:val="0"/>
           <w:numId w:val="2"/>
@@ -1314,7 +1314,7 @@
     </w:p>
     <w:p>
       <w:pPr>
-        <w:pStyle w:val="721"/>
+        <w:pStyle w:val="914"/>
         <w:numPr>
           <w:ilvl w:val="0"/>
           <w:numId w:val="2"/>
@@ -1336,7 +1336,7 @@
     </w:p>
     <w:p>
       <w:pPr>
-        <w:pStyle w:val="721"/>
+        <w:pStyle w:val="914"/>
         <w:numPr>
           <w:ilvl w:val="0"/>
           <w:numId w:val="2"/>
@@ -1358,7 +1358,7 @@
     </w:p>
     <w:p>
       <w:pPr>
-        <w:pStyle w:val="721"/>
+        <w:pStyle w:val="914"/>
         <w:numPr>
           <w:ilvl w:val="0"/>
           <w:numId w:val="2"/>
@@ -1380,7 +1380,7 @@
     </w:p>
     <w:p>
       <w:pPr>
-        <w:pStyle w:val="721"/>
+        <w:pStyle w:val="914"/>
         <w:numPr>
           <w:ilvl w:val="0"/>
           <w:numId w:val="2"/>
@@ -1412,7 +1412,7 @@
     </w:p>
     <w:p>
       <w:pPr>
-        <w:pStyle w:val="727"/>
+        <w:pStyle w:val="920"/>
         <w:pBdr/>
         <w:spacing w:after="80" w:before="240"/>
         <w:ind/>
@@ -1470,7 +1470,7 @@
     </w:p>
     <w:p>
       <w:pPr>
-        <w:pStyle w:val="721"/>
+        <w:pStyle w:val="914"/>
         <w:numPr>
           <w:ilvl w:val="0"/>
           <w:numId w:val="2"/>
@@ -1492,7 +1492,7 @@
     </w:p>
     <w:p>
       <w:pPr>
-        <w:pStyle w:val="721"/>
+        <w:pStyle w:val="914"/>
         <w:numPr>
           <w:ilvl w:val="0"/>
           <w:numId w:val="2"/>
@@ -1514,7 +1514,7 @@
     </w:p>
     <w:p>
       <w:pPr>
-        <w:pStyle w:val="721"/>
+        <w:pStyle w:val="914"/>
         <w:numPr>
           <w:ilvl w:val="0"/>
           <w:numId w:val="2"/>
@@ -1536,7 +1536,7 @@
     </w:p>
     <w:p>
       <w:pPr>
-        <w:pStyle w:val="721"/>
+        <w:pStyle w:val="914"/>
         <w:numPr>
           <w:ilvl w:val="0"/>
           <w:numId w:val="2"/>
@@ -1558,7 +1558,7 @@
     </w:p>
     <w:p>
       <w:pPr>
-        <w:pStyle w:val="721"/>
+        <w:pStyle w:val="914"/>
         <w:numPr>
           <w:ilvl w:val="0"/>
           <w:numId w:val="2"/>
@@ -1580,7 +1580,7 @@
     </w:p>
     <w:p>
       <w:pPr>
-        <w:pStyle w:val="721"/>
+        <w:pStyle w:val="914"/>
         <w:numPr>
           <w:ilvl w:val="0"/>
           <w:numId w:val="2"/>
@@ -1612,7 +1612,7 @@
     </w:p>
     <w:p>
       <w:pPr>
-        <w:pStyle w:val="727"/>
+        <w:pStyle w:val="920"/>
         <w:pBdr/>
         <w:spacing w:after="80" w:before="240"/>
         <w:ind/>
@@ -1670,7 +1670,7 @@
     </w:p>
     <w:p>
       <w:pPr>
-        <w:pStyle w:val="721"/>
+        <w:pStyle w:val="914"/>
         <w:numPr>
           <w:ilvl w:val="0"/>
           <w:numId w:val="2"/>
@@ -1692,7 +1692,7 @@
     </w:p>
     <w:p>
       <w:pPr>
-        <w:pStyle w:val="721"/>
+        <w:pStyle w:val="914"/>
         <w:numPr>
           <w:ilvl w:val="0"/>
           <w:numId w:val="2"/>
@@ -1714,7 +1714,7 @@
     </w:p>
     <w:p>
       <w:pPr>
-        <w:pStyle w:val="721"/>
+        <w:pStyle w:val="914"/>
         <w:numPr>
           <w:ilvl w:val="0"/>
           <w:numId w:val="2"/>
@@ -1736,7 +1736,7 @@
     </w:p>
     <w:p>
       <w:pPr>
-        <w:pStyle w:val="721"/>
+        <w:pStyle w:val="914"/>
         <w:numPr>
           <w:ilvl w:val="0"/>
           <w:numId w:val="2"/>
@@ -1758,7 +1758,7 @@
     </w:p>
     <w:p>
       <w:pPr>
-        <w:pStyle w:val="721"/>
+        <w:pStyle w:val="914"/>
         <w:numPr>
           <w:ilvl w:val="0"/>
           <w:numId w:val="2"/>
@@ -1790,7 +1790,7 @@
     </w:p>
     <w:p>
       <w:pPr>
-        <w:pStyle w:val="727"/>
+        <w:pStyle w:val="920"/>
         <w:pBdr/>
         <w:spacing w:after="80" w:before="240"/>
         <w:ind/>
@@ -1848,7 +1848,7 @@
     </w:p>
     <w:p>
       <w:pPr>
-        <w:pStyle w:val="721"/>
+        <w:pStyle w:val="914"/>
         <w:numPr>
           <w:ilvl w:val="0"/>
           <w:numId w:val="2"/>
@@ -1870,7 +1870,7 @@
     </w:p>
     <w:p>
       <w:pPr>
-        <w:pStyle w:val="721"/>
+        <w:pStyle w:val="914"/>
         <w:numPr>
           <w:ilvl w:val="0"/>
           <w:numId w:val="2"/>
@@ -1892,7 +1892,7 @@
     </w:p>
     <w:p>
       <w:pPr>
-        <w:pStyle w:val="721"/>
+        <w:pStyle w:val="914"/>
         <w:numPr>
           <w:ilvl w:val="0"/>
           <w:numId w:val="2"/>
@@ -1914,7 +1914,7 @@
     </w:p>
     <w:p>
       <w:pPr>
-        <w:pStyle w:val="721"/>
+        <w:pStyle w:val="914"/>
         <w:numPr>
           <w:ilvl w:val="0"/>
           <w:numId w:val="2"/>
@@ -1936,7 +1936,7 @@
     </w:p>
     <w:p>
       <w:pPr>
-        <w:pStyle w:val="721"/>
+        <w:pStyle w:val="914"/>
         <w:numPr>
           <w:ilvl w:val="0"/>
           <w:numId w:val="2"/>
@@ -1968,7 +1968,7 @@
     </w:p>
     <w:p>
       <w:pPr>
-        <w:pStyle w:val="727"/>
+        <w:pStyle w:val="920"/>
         <w:pBdr/>
         <w:spacing w:after="80" w:before="240"/>
         <w:ind/>
@@ -2026,7 +2026,7 @@
     </w:p>
     <w:p>
       <w:pPr>
-        <w:pStyle w:val="721"/>
+        <w:pStyle w:val="914"/>
         <w:numPr>
           <w:ilvl w:val="0"/>
           <w:numId w:val="2"/>
@@ -2048,7 +2048,7 @@
     </w:p>
     <w:p>
       <w:pPr>
-        <w:pStyle w:val="721"/>
+        <w:pStyle w:val="914"/>
         <w:numPr>
           <w:ilvl w:val="0"/>
           <w:numId w:val="2"/>
@@ -2070,7 +2070,7 @@
     </w:p>
     <w:p>
       <w:pPr>
-        <w:pStyle w:val="721"/>
+        <w:pStyle w:val="914"/>
         <w:numPr>
           <w:ilvl w:val="0"/>
           <w:numId w:val="2"/>
@@ -2092,7 +2092,7 @@
     </w:p>
     <w:p>
       <w:pPr>
-        <w:pStyle w:val="721"/>
+        <w:pStyle w:val="914"/>
         <w:numPr>
           <w:ilvl w:val="0"/>
           <w:numId w:val="2"/>
@@ -2114,7 +2114,7 @@
     </w:p>
     <w:p>
       <w:pPr>
-        <w:pStyle w:val="721"/>
+        <w:pStyle w:val="914"/>
         <w:numPr>
           <w:ilvl w:val="0"/>
           <w:numId w:val="2"/>
@@ -2146,7 +2146,7 @@
     </w:p>
     <w:p>
       <w:pPr>
-        <w:pStyle w:val="727"/>
+        <w:pStyle w:val="920"/>
         <w:pBdr/>
         <w:spacing w:after="80" w:before="240"/>
         <w:ind/>
@@ -2187,7 +2187,7 @@
     </w:p>
     <w:p>
       <w:pPr>
-        <w:pStyle w:val="721"/>
+        <w:pStyle w:val="914"/>
         <w:numPr>
           <w:ilvl w:val="0"/>
           <w:numId w:val="2"/>
@@ -2209,7 +2209,7 @@
     </w:p>
     <w:p>
       <w:pPr>
-        <w:pStyle w:val="721"/>
+        <w:pStyle w:val="914"/>
         <w:numPr>
           <w:ilvl w:val="0"/>
           <w:numId w:val="2"/>
@@ -2231,7 +2231,7 @@
     </w:p>
     <w:p>
       <w:pPr>
-        <w:pStyle w:val="721"/>
+        <w:pStyle w:val="914"/>
         <w:numPr>
           <w:ilvl w:val="0"/>
           <w:numId w:val="2"/>
@@ -2253,7 +2253,7 @@
     </w:p>
     <w:p>
       <w:pPr>
-        <w:pStyle w:val="721"/>
+        <w:pStyle w:val="914"/>
         <w:numPr>
           <w:ilvl w:val="0"/>
           <w:numId w:val="2"/>
@@ -2305,7 +2305,7 @@
     </w:p>
     <w:p>
       <w:pPr>
-        <w:pStyle w:val="721"/>
+        <w:pStyle w:val="914"/>
         <w:numPr>
           <w:ilvl w:val="0"/>
           <w:numId w:val="2"/>
@@ -2327,7 +2327,7 @@
     </w:p>
     <w:p>
       <w:pPr>
-        <w:pStyle w:val="721"/>
+        <w:pStyle w:val="914"/>
         <w:numPr>
           <w:ilvl w:val="0"/>
           <w:numId w:val="2"/>
@@ -2349,7 +2349,7 @@
     </w:p>
     <w:p>
       <w:pPr>
-        <w:pStyle w:val="721"/>
+        <w:pStyle w:val="914"/>
         <w:numPr>
           <w:ilvl w:val="0"/>
           <w:numId w:val="2"/>
@@ -2371,7 +2371,7 @@
     </w:p>
     <w:p>
       <w:pPr>
-        <w:pStyle w:val="721"/>
+        <w:pStyle w:val="914"/>
         <w:numPr>
           <w:ilvl w:val="0"/>
           <w:numId w:val="2"/>
@@ -2423,7 +2423,7 @@
     </w:p>
     <w:p>
       <w:pPr>
-        <w:pStyle w:val="721"/>
+        <w:pStyle w:val="914"/>
         <w:numPr>
           <w:ilvl w:val="0"/>
           <w:numId w:val="2"/>
@@ -2445,7 +2445,7 @@
     </w:p>
     <w:p>
       <w:pPr>
-        <w:pStyle w:val="721"/>
+        <w:pStyle w:val="914"/>
         <w:numPr>
           <w:ilvl w:val="0"/>
           <w:numId w:val="2"/>
@@ -2467,7 +2467,7 @@
     </w:p>
     <w:p>
       <w:pPr>
-        <w:pStyle w:val="721"/>
+        <w:pStyle w:val="914"/>
         <w:numPr>
           <w:ilvl w:val="0"/>
           <w:numId w:val="2"/>
@@ -2489,7 +2489,7 @@
     </w:p>
     <w:p>
       <w:pPr>
-        <w:pStyle w:val="721"/>
+        <w:pStyle w:val="914"/>
         <w:numPr>
           <w:ilvl w:val="0"/>
           <w:numId w:val="2"/>
@@ -2541,7 +2541,7 @@
     </w:p>
     <w:p>
       <w:pPr>
-        <w:pStyle w:val="721"/>
+        <w:pStyle w:val="914"/>
         <w:numPr>
           <w:ilvl w:val="0"/>
           <w:numId w:val="2"/>
@@ -2563,7 +2563,7 @@
     </w:p>
     <w:p>
       <w:pPr>
-        <w:pStyle w:val="721"/>
+        <w:pStyle w:val="914"/>
         <w:numPr>
           <w:ilvl w:val="0"/>
           <w:numId w:val="2"/>
@@ -2585,7 +2585,7 @@
     </w:p>
     <w:p>
       <w:pPr>
-        <w:pStyle w:val="721"/>
+        <w:pStyle w:val="914"/>
         <w:numPr>
           <w:ilvl w:val="0"/>
           <w:numId w:val="2"/>
@@ -2607,7 +2607,7 @@
     </w:p>
     <w:p>
       <w:pPr>
-        <w:pStyle w:val="721"/>
+        <w:pStyle w:val="914"/>
         <w:numPr>
           <w:ilvl w:val="0"/>
           <w:numId w:val="2"/>
@@ -2659,7 +2659,7 @@
     </w:p>
     <w:p>
       <w:pPr>
-        <w:pStyle w:val="721"/>
+        <w:pStyle w:val="914"/>
         <w:numPr>
           <w:ilvl w:val="0"/>
           <w:numId w:val="2"/>
@@ -2681,7 +2681,7 @@
     </w:p>
     <w:p>
       <w:pPr>
-        <w:pStyle w:val="721"/>
+        <w:pStyle w:val="914"/>
         <w:numPr>
           <w:ilvl w:val="0"/>
           <w:numId w:val="2"/>
@@ -2703,7 +2703,7 @@
     </w:p>
     <w:p>
       <w:pPr>
-        <w:pStyle w:val="721"/>
+        <w:pStyle w:val="914"/>
         <w:numPr>
           <w:ilvl w:val="0"/>
           <w:numId w:val="2"/>
@@ -2725,7 +2725,7 @@
     </w:p>
     <w:p>
       <w:pPr>
-        <w:pStyle w:val="721"/>
+        <w:pStyle w:val="914"/>
         <w:numPr>
           <w:ilvl w:val="0"/>
           <w:numId w:val="2"/>
@@ -2777,7 +2777,7 @@
     </w:p>
     <w:p>
       <w:pPr>
-        <w:pStyle w:val="721"/>
+        <w:pStyle w:val="914"/>
         <w:numPr>
           <w:ilvl w:val="0"/>
           <w:numId w:val="2"/>
@@ -2799,7 +2799,7 @@
     </w:p>
     <w:p>
       <w:pPr>
-        <w:pStyle w:val="721"/>
+        <w:pStyle w:val="914"/>
         <w:numPr>
           <w:ilvl w:val="0"/>
           <w:numId w:val="2"/>
@@ -2821,7 +2821,7 @@
     </w:p>
     <w:p>
       <w:pPr>
-        <w:pStyle w:val="721"/>
+        <w:pStyle w:val="914"/>
         <w:numPr>
           <w:ilvl w:val="0"/>
           <w:numId w:val="2"/>
@@ -2843,7 +2843,7 @@
     </w:p>
     <w:p>
       <w:pPr>
-        <w:pStyle w:val="721"/>
+        <w:pStyle w:val="914"/>
         <w:numPr>
           <w:ilvl w:val="0"/>
           <w:numId w:val="2"/>
@@ -2887,7 +2887,7 @@
     </w:p>
     <w:p>
       <w:pPr>
-        <w:pStyle w:val="726"/>
+        <w:pStyle w:val="919"/>
         <w:pBdr/>
         <w:spacing w:after="120" w:before="360"/>
         <w:ind/>
@@ -10719,7 +10719,7 @@
     </w:p>
     <w:p>
       <w:pPr>
-        <w:pStyle w:val="726"/>
+        <w:pStyle w:val="919"/>
         <w:pBdr/>
         <w:spacing w:after="120" w:before="360"/>
         <w:ind/>
@@ -10779,7 +10779,7 @@
     </w:p>
     <w:p>
       <w:pPr>
-        <w:pStyle w:val="727"/>
+        <w:pStyle w:val="920"/>
         <w:pBdr/>
         <w:spacing w:after="80" w:before="240"/>
         <w:ind/>
@@ -11138,7 +11138,7 @@
     </w:p>
     <w:p>
       <w:pPr>
-        <w:pStyle w:val="727"/>
+        <w:pStyle w:val="920"/>
         <w:pBdr/>
         <w:spacing w:after="80" w:before="240"/>
         <w:ind/>
@@ -11328,7 +11328,7 @@
                 <w:sz w:val="20"/>
                 <w:szCs w:val="20"/>
               </w:rPr>
-              <w:t xml:space="preserve">All user passwords shall be stored using a strong hashing algorithm (e.g., bcrypt) and never stored in plain text.</w:t>
+              <w:t xml:space="preserve">All user passwords shall be stored using a strong hashing algorithm and never stored in plain text.</w:t>
             </w:r>
             <w:r/>
           </w:p>
@@ -11403,7 +11403,7 @@
                 <w:sz w:val="20"/>
                 <w:szCs w:val="20"/>
               </w:rPr>
-              <w:t xml:space="preserve">The system shall enforce role-based access control (RBAC), ensuring users can only access functions authorized to their role.</w:t>
+              <w:t xml:space="preserve">The system shall enforce role-based access control, ensuring users can only access functions authorized to their role.</w:t>
             </w:r>
             <w:r/>
           </w:p>
@@ -11478,7 +11478,7 @@
                 <w:sz w:val="20"/>
                 <w:szCs w:val="20"/>
               </w:rPr>
-              <w:t xml:space="preserve">All data transmitted between the client and server shall be encrypted using HTTPS/TLS.</w:t>
+              <w:t xml:space="preserve">All data transmitted between the client and server shall be encrypted using HTTPS.</w:t>
             </w:r>
             <w:r/>
           </w:p>
@@ -11647,7 +11647,7 @@
     </w:p>
     <w:p>
       <w:pPr>
-        <w:pStyle w:val="727"/>
+        <w:pStyle w:val="920"/>
         <w:pBdr/>
         <w:spacing w:after="80" w:before="240"/>
         <w:ind/>
@@ -11913,7 +11913,7 @@
                 <w:sz w:val="20"/>
                 <w:szCs w:val="20"/>
               </w:rPr>
-              <w:t xml:space="preserve">The system shall be accessible and functional on modern web browsers (Chrome, Firefox, Edge, Safari) without plugin installation.</w:t>
+              <w:t xml:space="preserve">The system shall be accessible and functional on modern web browsers without plugin installation.</w:t>
             </w:r>
             <w:r/>
           </w:p>
@@ -12082,7 +12082,7 @@
     </w:p>
     <w:p>
       <w:pPr>
-        <w:pStyle w:val="727"/>
+        <w:pStyle w:val="920"/>
         <w:pBdr/>
         <w:spacing w:after="80" w:before="240"/>
         <w:ind/>
@@ -12442,7 +12442,7 @@
     </w:p>
     <w:p>
       <w:pPr>
-        <w:pStyle w:val="727"/>
+        <w:pStyle w:val="920"/>
         <w:pBdr/>
         <w:spacing w:after="80" w:before="240"/>
         <w:ind/>
@@ -12708,7 +12708,7 @@
                 <w:sz w:val="20"/>
                 <w:szCs w:val="20"/>
               </w:rPr>
-              <w:t xml:space="preserve">The system architecture shall allow new modules (e.g., library management, alumni tracking) to be integrated without major restructuring.</w:t>
+              <w:t xml:space="preserve">The system architecture shall allow new modules  to be integrated without major restructuring.</w:t>
             </w:r>
             <w:r/>
           </w:p>
@@ -12727,7 +12727,7 @@
     </w:p>
     <w:p>
       <w:pPr>
-        <w:pStyle w:val="727"/>
+        <w:pStyle w:val="920"/>
         <w:pBdr/>
         <w:spacing w:after="80" w:before="240"/>
         <w:ind/>
@@ -13012,7 +13012,7 @@
     </w:p>
     <w:p>
       <w:pPr>
-        <w:pStyle w:val="727"/>
+        <w:pStyle w:val="920"/>
         <w:pBdr/>
         <w:spacing w:after="80" w:before="240"/>
         <w:ind/>
@@ -13314,9 +13314,6 @@
         <w:t xml:space="preserve">Total Non-Functional Requirements: 21</w:t>
       </w:r>
       <w:r/>
-      <w:r/>
-      <w:r/>
-      <w:r/>
     </w:p>
     <w:sectPr>
       <w:headerReference w:type="default" r:id="rId9"/>
@@ -13342,7 +13339,6 @@
         <w:ind/>
         <w:rPr/>
       </w:pPr>
-      <w:r/>
       <w:r>
         <w:separator/>
       </w:r>
@@ -13357,7 +13353,6 @@
         <w:ind/>
         <w:rPr/>
       </w:pPr>
-      <w:r/>
       <w:r>
         <w:continuationSeparator/>
       </w:r>
@@ -13445,7 +13440,6 @@
         <w:ind/>
         <w:rPr/>
       </w:pPr>
-      <w:r/>
       <w:r>
         <w:separator/>
       </w:r>
@@ -13460,7 +13454,6 @@
         <w:ind/>
         <w:rPr/>
       </w:pPr>
-      <w:r/>
       <w:r>
         <w:continuationSeparator/>
       </w:r>
@@ -14062,7 +14055,7 @@
     <w:lsdException w:name="Bibliography" w:uiPriority="37"/>
     <w:lsdException w:name="TOC Heading" w:uiPriority="39" w:qFormat="1"/>
   </w:latentStyles>
-  <w:style w:type="table" w:styleId="11" w:default="1">
+  <w:style w:type="table" w:styleId="731" w:default="1">
     <w:name w:val="Normal Table"/>
     <w:uiPriority w:val="99"/>
     <w:semiHidden/>
@@ -14255,9 +14248,9 @@
       </w:tcPr>
     </w:tblStylePr>
   </w:style>
-  <w:style w:type="table" w:styleId="12">
+  <w:style w:type="table" w:styleId="732">
     <w:name w:val="Table Grid"/>
-    <w:basedOn w:val="11"/>
+    <w:basedOn w:val="731"/>
     <w:uiPriority w:val="59"/>
     <w:pPr>
       <w:pBdr/>
@@ -14454,9 +14447,9 @@
       </w:tcPr>
     </w:tblStylePr>
   </w:style>
-  <w:style w:type="table" w:styleId="13">
+  <w:style w:type="table" w:styleId="733">
     <w:name w:val="Table Grid Light"/>
-    <w:basedOn w:val="11"/>
+    <w:basedOn w:val="731"/>
     <w:uiPriority w:val="59"/>
     <w:pPr>
       <w:pBdr/>
@@ -14653,9 +14646,9 @@
       </w:tcPr>
     </w:tblStylePr>
   </w:style>
-  <w:style w:type="table" w:styleId="14">
+  <w:style w:type="table" w:styleId="734">
     <w:name w:val="Plain Table 1"/>
-    <w:basedOn w:val="11"/>
+    <w:basedOn w:val="731"/>
     <w:uiPriority w:val="59"/>
     <w:pPr>
       <w:pBdr/>
@@ -14878,9 +14871,9 @@
       </w:tcPr>
     </w:tblStylePr>
   </w:style>
-  <w:style w:type="table" w:styleId="15">
+  <w:style w:type="table" w:styleId="735">
     <w:name w:val="Plain Table 2"/>
-    <w:basedOn w:val="11"/>
+    <w:basedOn w:val="731"/>
     <w:uiPriority w:val="59"/>
     <w:pPr>
       <w:pBdr/>
@@ -15111,9 +15104,9 @@
       </w:tcPr>
     </w:tblStylePr>
   </w:style>
-  <w:style w:type="table" w:styleId="16">
+  <w:style w:type="table" w:styleId="736">
     <w:name w:val="Plain Table 3"/>
-    <w:basedOn w:val="11"/>
+    <w:basedOn w:val="731"/>
     <w:uiPriority w:val="99"/>
     <w:pPr>
       <w:pBdr/>
@@ -15341,9 +15334,9 @@
       </w:tcPr>
     </w:tblStylePr>
   </w:style>
-  <w:style w:type="table" w:styleId="17">
+  <w:style w:type="table" w:styleId="737">
     <w:name w:val="Plain Table 4"/>
-    <w:basedOn w:val="11"/>
+    <w:basedOn w:val="731"/>
     <w:uiPriority w:val="99"/>
     <w:pPr>
       <w:pBdr/>
@@ -15557,9 +15550,9 @@
       </w:tcPr>
     </w:tblStylePr>
   </w:style>
-  <w:style w:type="table" w:styleId="18">
+  <w:style w:type="table" w:styleId="738">
     <w:name w:val="Plain Table 5"/>
-    <w:basedOn w:val="11"/>
+    <w:basedOn w:val="731"/>
     <w:uiPriority w:val="99"/>
     <w:pPr>
       <w:pBdr/>
@@ -15790,9 +15783,9 @@
       </w:tcPr>
     </w:tblStylePr>
   </w:style>
-  <w:style w:type="table" w:styleId="19">
+  <w:style w:type="table" w:styleId="739">
     <w:name w:val="Grid Table 1 Light"/>
-    <w:basedOn w:val="11"/>
+    <w:basedOn w:val="731"/>
     <w:uiPriority w:val="99"/>
     <w:pPr>
       <w:pBdr/>
@@ -16013,9 +16006,9 @@
       </w:tcPr>
     </w:tblStylePr>
   </w:style>
-  <w:style w:type="table" w:styleId="20">
+  <w:style w:type="table" w:styleId="740">
     <w:name w:val="Grid Table 1 Light - Accent 1"/>
-    <w:basedOn w:val="11"/>
+    <w:basedOn w:val="731"/>
     <w:uiPriority w:val="99"/>
     <w:pPr>
       <w:pBdr/>
@@ -16236,9 +16229,9 @@
       </w:tcPr>
     </w:tblStylePr>
   </w:style>
-  <w:style w:type="table" w:styleId="21">
+  <w:style w:type="table" w:styleId="741">
     <w:name w:val="Grid Table 1 Light - Accent 2"/>
-    <w:basedOn w:val="11"/>
+    <w:basedOn w:val="731"/>
     <w:uiPriority w:val="99"/>
     <w:pPr>
       <w:pBdr/>
@@ -16459,9 +16452,9 @@
       </w:tcPr>
     </w:tblStylePr>
   </w:style>
-  <w:style w:type="table" w:styleId="22">
+  <w:style w:type="table" w:styleId="742">
     <w:name w:val="Grid Table 1 Light - Accent 3"/>
-    <w:basedOn w:val="11"/>
+    <w:basedOn w:val="731"/>
     <w:uiPriority w:val="99"/>
     <w:pPr>
       <w:pBdr/>
@@ -16682,9 +16675,9 @@
       </w:tcPr>
     </w:tblStylePr>
   </w:style>
-  <w:style w:type="table" w:styleId="23">
+  <w:style w:type="table" w:styleId="743">
     <w:name w:val="Grid Table 1 Light - Accent 4"/>
-    <w:basedOn w:val="11"/>
+    <w:basedOn w:val="731"/>
     <w:uiPriority w:val="99"/>
     <w:pPr>
       <w:pBdr/>
@@ -16905,9 +16898,9 @@
       </w:tcPr>
     </w:tblStylePr>
   </w:style>
-  <w:style w:type="table" w:styleId="24">
+  <w:style w:type="table" w:styleId="744">
     <w:name w:val="Grid Table 1 Light - Accent 5"/>
-    <w:basedOn w:val="11"/>
+    <w:basedOn w:val="731"/>
     <w:uiPriority w:val="99"/>
     <w:pPr>
       <w:pBdr/>
@@ -17128,9 +17121,9 @@
       </w:tcPr>
     </w:tblStylePr>
   </w:style>
-  <w:style w:type="table" w:styleId="25">
+  <w:style w:type="table" w:styleId="745">
     <w:name w:val="Grid Table 1 Light - Accent 6"/>
-    <w:basedOn w:val="11"/>
+    <w:basedOn w:val="731"/>
     <w:uiPriority w:val="99"/>
     <w:pPr>
       <w:pBdr/>
@@ -17351,9 +17344,9 @@
       </w:tcPr>
     </w:tblStylePr>
   </w:style>
-  <w:style w:type="table" w:styleId="26">
+  <w:style w:type="table" w:styleId="746">
     <w:name w:val="Grid Table 2"/>
-    <w:basedOn w:val="11"/>
+    <w:basedOn w:val="731"/>
     <w:uiPriority w:val="99"/>
     <w:pPr>
       <w:pBdr/>
@@ -17583,9 +17576,9 @@
       </w:tcPr>
     </w:tblStylePr>
   </w:style>
-  <w:style w:type="table" w:styleId="27">
+  <w:style w:type="table" w:styleId="747">
     <w:name w:val="Grid Table 2 - Accent 1"/>
-    <w:basedOn w:val="11"/>
+    <w:basedOn w:val="731"/>
     <w:uiPriority w:val="99"/>
     <w:pPr>
       <w:pBdr/>
@@ -17815,9 +17808,9 @@
       </w:tcPr>
     </w:tblStylePr>
   </w:style>
-  <w:style w:type="table" w:styleId="28">
+  <w:style w:type="table" w:styleId="748">
     <w:name w:val="Grid Table 2 - Accent 2"/>
-    <w:basedOn w:val="11"/>
+    <w:basedOn w:val="731"/>
     <w:uiPriority w:val="99"/>
     <w:pPr>
       <w:pBdr/>
@@ -18047,9 +18040,9 @@
       </w:tcPr>
     </w:tblStylePr>
   </w:style>
-  <w:style w:type="table" w:styleId="29">
+  <w:style w:type="table" w:styleId="749">
     <w:name w:val="Grid Table 2 - Accent 3"/>
-    <w:basedOn w:val="11"/>
+    <w:basedOn w:val="731"/>
     <w:uiPriority w:val="99"/>
     <w:pPr>
       <w:pBdr/>
@@ -18279,9 +18272,9 @@
       </w:tcPr>
     </w:tblStylePr>
   </w:style>
-  <w:style w:type="table" w:styleId="30">
+  <w:style w:type="table" w:styleId="750">
     <w:name w:val="Grid Table 2 - Accent 4"/>
-    <w:basedOn w:val="11"/>
+    <w:basedOn w:val="731"/>
     <w:uiPriority w:val="99"/>
     <w:pPr>
       <w:pBdr/>
@@ -18511,9 +18504,9 @@
       </w:tcPr>
     </w:tblStylePr>
   </w:style>
-  <w:style w:type="table" w:styleId="31">
+  <w:style w:type="table" w:styleId="751">
     <w:name w:val="Grid Table 2 - Accent 5"/>
-    <w:basedOn w:val="11"/>
+    <w:basedOn w:val="731"/>
     <w:uiPriority w:val="99"/>
     <w:pPr>
       <w:pBdr/>
@@ -18743,9 +18736,9 @@
       </w:tcPr>
     </w:tblStylePr>
   </w:style>
-  <w:style w:type="table" w:styleId="32">
+  <w:style w:type="table" w:styleId="752">
     <w:name w:val="Grid Table 2 - Accent 6"/>
-    <w:basedOn w:val="11"/>
+    <w:basedOn w:val="731"/>
     <w:uiPriority w:val="99"/>
     <w:pPr>
       <w:pBdr/>
@@ -18975,9 +18968,9 @@
       </w:tcPr>
     </w:tblStylePr>
   </w:style>
-  <w:style w:type="table" w:styleId="33">
+  <w:style w:type="table" w:styleId="753">
     <w:name w:val="Grid Table 3"/>
-    <w:basedOn w:val="11"/>
+    <w:basedOn w:val="731"/>
     <w:uiPriority w:val="99"/>
     <w:pPr>
       <w:pBdr/>
@@ -19076,29 +19069,6 @@
         <w:tblBorders/>
       </w:tblPr>
       <w:tcPr>
-        <w:shd w:color="ffffff"/>
-        <w:tcBorders>
-          <w:top w:val="none" w:color="000000" w:sz="4" w:space="0"/>
-          <w:left w:val="none" w:color="000000" w:sz="4" w:space="0"/>
-          <w:bottom w:val="none" w:color="000000" w:sz="4" w:space="0"/>
-          <w:right w:val="none" w:color="000000" w:sz="4" w:space="0"/>
-        </w:tcBorders>
-      </w:tcPr>
-    </w:tblStylePr>
-    <w:tblStylePr w:type="firstRow">
-      <w:rPr>
-        <w:b/>
-        <w:color w:val="404040"/>
-      </w:rPr>
-      <w:pPr>
-        <w:pBdr/>
-        <w:spacing/>
-        <w:ind/>
-      </w:pPr>
-      <w:tblPr>
-        <w:tblBorders/>
-      </w:tblPr>
-      <w:tcPr>
         <w:shd w:val="clear" w:color="ffffff"/>
         <w:tcBorders>
           <w:top w:val="none" w:color="000000" w:sz="4" w:space="0"/>
@@ -19108,30 +19078,7 @@
         </w:tcBorders>
       </w:tcPr>
     </w:tblStylePr>
-    <w:tblStylePr w:type="lastCol">
-      <w:rPr>
-        <w:i/>
-        <w:color w:val="404040"/>
-      </w:rPr>
-      <w:pPr>
-        <w:pBdr/>
-        <w:spacing/>
-        <w:ind/>
-      </w:pPr>
-      <w:tblPr>
-        <w:tblBorders/>
-      </w:tblPr>
-      <w:tcPr>
-        <w:shd w:color="ffffff"/>
-        <w:tcBorders>
-          <w:top w:val="none" w:color="000000" w:sz="4" w:space="0"/>
-          <w:left w:val="none" w:color="000000" w:sz="4" w:space="0"/>
-          <w:bottom w:val="none" w:color="000000" w:sz="4" w:space="0"/>
-          <w:right w:val="none" w:color="000000" w:sz="4" w:space="0"/>
-        </w:tcBorders>
-      </w:tcPr>
-    </w:tblStylePr>
-    <w:tblStylePr w:type="lastRow">
+    <w:tblStylePr w:type="firstRow">
       <w:rPr>
         <w:b/>
         <w:color w:val="404040"/>
@@ -19154,6 +19101,52 @@
         </w:tcBorders>
       </w:tcPr>
     </w:tblStylePr>
+    <w:tblStylePr w:type="lastCol">
+      <w:rPr>
+        <w:i/>
+        <w:color w:val="404040"/>
+      </w:rPr>
+      <w:pPr>
+        <w:pBdr/>
+        <w:spacing/>
+        <w:ind/>
+      </w:pPr>
+      <w:tblPr>
+        <w:tblBorders/>
+      </w:tblPr>
+      <w:tcPr>
+        <w:shd w:val="clear" w:color="ffffff"/>
+        <w:tcBorders>
+          <w:top w:val="none" w:color="000000" w:sz="4" w:space="0"/>
+          <w:left w:val="none" w:color="000000" w:sz="4" w:space="0"/>
+          <w:bottom w:val="none" w:color="000000" w:sz="4" w:space="0"/>
+          <w:right w:val="none" w:color="000000" w:sz="4" w:space="0"/>
+        </w:tcBorders>
+      </w:tcPr>
+    </w:tblStylePr>
+    <w:tblStylePr w:type="lastRow">
+      <w:rPr>
+        <w:b/>
+        <w:color w:val="404040"/>
+      </w:rPr>
+      <w:pPr>
+        <w:pBdr/>
+        <w:spacing/>
+        <w:ind/>
+      </w:pPr>
+      <w:tblPr>
+        <w:tblBorders/>
+      </w:tblPr>
+      <w:tcPr>
+        <w:shd w:val="clear" w:color="ffffff"/>
+        <w:tcBorders>
+          <w:top w:val="none" w:color="000000" w:sz="4" w:space="0"/>
+          <w:left w:val="none" w:color="000000" w:sz="4" w:space="0"/>
+          <w:bottom w:val="none" w:color="000000" w:sz="4" w:space="0"/>
+          <w:right w:val="none" w:color="000000" w:sz="4" w:space="0"/>
+        </w:tcBorders>
+      </w:tcPr>
+    </w:tblStylePr>
     <w:tblStylePr w:type="nwCell">
       <w:pPr>
         <w:pBdr/>
@@ -19220,9 +19213,9 @@
       </w:tcPr>
     </w:tblStylePr>
   </w:style>
-  <w:style w:type="table" w:styleId="34">
+  <w:style w:type="table" w:styleId="754">
     <w:name w:val="Grid Table 3 - Accent 1"/>
-    <w:basedOn w:val="11"/>
+    <w:basedOn w:val="731"/>
     <w:uiPriority w:val="99"/>
     <w:pPr>
       <w:pBdr/>
@@ -19321,29 +19314,6 @@
         <w:tblBorders/>
       </w:tblPr>
       <w:tcPr>
-        <w:shd w:color="ffffff"/>
-        <w:tcBorders>
-          <w:top w:val="none" w:color="000000" w:sz="4" w:space="0"/>
-          <w:left w:val="none" w:color="000000" w:sz="4" w:space="0"/>
-          <w:bottom w:val="none" w:color="000000" w:sz="4" w:space="0"/>
-          <w:right w:val="none" w:color="000000" w:sz="4" w:space="0"/>
-        </w:tcBorders>
-      </w:tcPr>
-    </w:tblStylePr>
-    <w:tblStylePr w:type="firstRow">
-      <w:rPr>
-        <w:b/>
-        <w:color w:val="404040"/>
-      </w:rPr>
-      <w:pPr>
-        <w:pBdr/>
-        <w:spacing/>
-        <w:ind/>
-      </w:pPr>
-      <w:tblPr>
-        <w:tblBorders/>
-      </w:tblPr>
-      <w:tcPr>
         <w:shd w:val="clear" w:color="ffffff"/>
         <w:tcBorders>
           <w:top w:val="none" w:color="000000" w:sz="4" w:space="0"/>
@@ -19353,30 +19323,7 @@
         </w:tcBorders>
       </w:tcPr>
     </w:tblStylePr>
-    <w:tblStylePr w:type="lastCol">
-      <w:rPr>
-        <w:i/>
-        <w:color w:val="404040"/>
-      </w:rPr>
-      <w:pPr>
-        <w:pBdr/>
-        <w:spacing/>
-        <w:ind/>
-      </w:pPr>
-      <w:tblPr>
-        <w:tblBorders/>
-      </w:tblPr>
-      <w:tcPr>
-        <w:shd w:color="ffffff"/>
-        <w:tcBorders>
-          <w:top w:val="none" w:color="000000" w:sz="4" w:space="0"/>
-          <w:left w:val="none" w:color="000000" w:sz="4" w:space="0"/>
-          <w:bottom w:val="none" w:color="000000" w:sz="4" w:space="0"/>
-          <w:right w:val="none" w:color="000000" w:sz="4" w:space="0"/>
-        </w:tcBorders>
-      </w:tcPr>
-    </w:tblStylePr>
-    <w:tblStylePr w:type="lastRow">
+    <w:tblStylePr w:type="firstRow">
       <w:rPr>
         <w:b/>
         <w:color w:val="404040"/>
@@ -19399,6 +19346,52 @@
         </w:tcBorders>
       </w:tcPr>
     </w:tblStylePr>
+    <w:tblStylePr w:type="lastCol">
+      <w:rPr>
+        <w:i/>
+        <w:color w:val="404040"/>
+      </w:rPr>
+      <w:pPr>
+        <w:pBdr/>
+        <w:spacing/>
+        <w:ind/>
+      </w:pPr>
+      <w:tblPr>
+        <w:tblBorders/>
+      </w:tblPr>
+      <w:tcPr>
+        <w:shd w:val="clear" w:color="ffffff"/>
+        <w:tcBorders>
+          <w:top w:val="none" w:color="000000" w:sz="4" w:space="0"/>
+          <w:left w:val="none" w:color="000000" w:sz="4" w:space="0"/>
+          <w:bottom w:val="none" w:color="000000" w:sz="4" w:space="0"/>
+          <w:right w:val="none" w:color="000000" w:sz="4" w:space="0"/>
+        </w:tcBorders>
+      </w:tcPr>
+    </w:tblStylePr>
+    <w:tblStylePr w:type="lastRow">
+      <w:rPr>
+        <w:b/>
+        <w:color w:val="404040"/>
+      </w:rPr>
+      <w:pPr>
+        <w:pBdr/>
+        <w:spacing/>
+        <w:ind/>
+      </w:pPr>
+      <w:tblPr>
+        <w:tblBorders/>
+      </w:tblPr>
+      <w:tcPr>
+        <w:shd w:val="clear" w:color="ffffff"/>
+        <w:tcBorders>
+          <w:top w:val="none" w:color="000000" w:sz="4" w:space="0"/>
+          <w:left w:val="none" w:color="000000" w:sz="4" w:space="0"/>
+          <w:bottom w:val="none" w:color="000000" w:sz="4" w:space="0"/>
+          <w:right w:val="none" w:color="000000" w:sz="4" w:space="0"/>
+        </w:tcBorders>
+      </w:tcPr>
+    </w:tblStylePr>
     <w:tblStylePr w:type="nwCell">
       <w:pPr>
         <w:pBdr/>
@@ -19465,9 +19458,9 @@
       </w:tcPr>
     </w:tblStylePr>
   </w:style>
-  <w:style w:type="table" w:styleId="35">
+  <w:style w:type="table" w:styleId="755">
     <w:name w:val="Grid Table 3 - Accent 2"/>
-    <w:basedOn w:val="11"/>
+    <w:basedOn w:val="731"/>
     <w:uiPriority w:val="99"/>
     <w:pPr>
       <w:pBdr/>
@@ -19566,29 +19559,6 @@
         <w:tblBorders/>
       </w:tblPr>
       <w:tcPr>
-        <w:shd w:color="ffffff"/>
-        <w:tcBorders>
-          <w:top w:val="none" w:color="000000" w:sz="4" w:space="0"/>
-          <w:left w:val="none" w:color="000000" w:sz="4" w:space="0"/>
-          <w:bottom w:val="none" w:color="000000" w:sz="4" w:space="0"/>
-          <w:right w:val="none" w:color="000000" w:sz="4" w:space="0"/>
-        </w:tcBorders>
-      </w:tcPr>
-    </w:tblStylePr>
-    <w:tblStylePr w:type="firstRow">
-      <w:rPr>
-        <w:b/>
-        <w:color w:val="404040"/>
-      </w:rPr>
-      <w:pPr>
-        <w:pBdr/>
-        <w:spacing/>
-        <w:ind/>
-      </w:pPr>
-      <w:tblPr>
-        <w:tblBorders/>
-      </w:tblPr>
-      <w:tcPr>
         <w:shd w:val="clear" w:color="ffffff"/>
         <w:tcBorders>
           <w:top w:val="none" w:color="000000" w:sz="4" w:space="0"/>
@@ -19598,30 +19568,7 @@
         </w:tcBorders>
       </w:tcPr>
     </w:tblStylePr>
-    <w:tblStylePr w:type="lastCol">
-      <w:rPr>
-        <w:i/>
-        <w:color w:val="404040"/>
-      </w:rPr>
-      <w:pPr>
-        <w:pBdr/>
-        <w:spacing/>
-        <w:ind/>
-      </w:pPr>
-      <w:tblPr>
-        <w:tblBorders/>
-      </w:tblPr>
-      <w:tcPr>
-        <w:shd w:color="ffffff"/>
-        <w:tcBorders>
-          <w:top w:val="none" w:color="000000" w:sz="4" w:space="0"/>
-          <w:left w:val="none" w:color="000000" w:sz="4" w:space="0"/>
-          <w:bottom w:val="none" w:color="000000" w:sz="4" w:space="0"/>
-          <w:right w:val="none" w:color="000000" w:sz="4" w:space="0"/>
-        </w:tcBorders>
-      </w:tcPr>
-    </w:tblStylePr>
-    <w:tblStylePr w:type="lastRow">
+    <w:tblStylePr w:type="firstRow">
       <w:rPr>
         <w:b/>
         <w:color w:val="404040"/>
@@ -19644,6 +19591,52 @@
         </w:tcBorders>
       </w:tcPr>
     </w:tblStylePr>
+    <w:tblStylePr w:type="lastCol">
+      <w:rPr>
+        <w:i/>
+        <w:color w:val="404040"/>
+      </w:rPr>
+      <w:pPr>
+        <w:pBdr/>
+        <w:spacing/>
+        <w:ind/>
+      </w:pPr>
+      <w:tblPr>
+        <w:tblBorders/>
+      </w:tblPr>
+      <w:tcPr>
+        <w:shd w:val="clear" w:color="ffffff"/>
+        <w:tcBorders>
+          <w:top w:val="none" w:color="000000" w:sz="4" w:space="0"/>
+          <w:left w:val="none" w:color="000000" w:sz="4" w:space="0"/>
+          <w:bottom w:val="none" w:color="000000" w:sz="4" w:space="0"/>
+          <w:right w:val="none" w:color="000000" w:sz="4" w:space="0"/>
+        </w:tcBorders>
+      </w:tcPr>
+    </w:tblStylePr>
+    <w:tblStylePr w:type="lastRow">
+      <w:rPr>
+        <w:b/>
+        <w:color w:val="404040"/>
+      </w:rPr>
+      <w:pPr>
+        <w:pBdr/>
+        <w:spacing/>
+        <w:ind/>
+      </w:pPr>
+      <w:tblPr>
+        <w:tblBorders/>
+      </w:tblPr>
+      <w:tcPr>
+        <w:shd w:val="clear" w:color="ffffff"/>
+        <w:tcBorders>
+          <w:top w:val="none" w:color="000000" w:sz="4" w:space="0"/>
+          <w:left w:val="none" w:color="000000" w:sz="4" w:space="0"/>
+          <w:bottom w:val="none" w:color="000000" w:sz="4" w:space="0"/>
+          <w:right w:val="none" w:color="000000" w:sz="4" w:space="0"/>
+        </w:tcBorders>
+      </w:tcPr>
+    </w:tblStylePr>
     <w:tblStylePr w:type="nwCell">
       <w:pPr>
         <w:pBdr/>
@@ -19710,9 +19703,9 @@
       </w:tcPr>
     </w:tblStylePr>
   </w:style>
-  <w:style w:type="table" w:styleId="36">
+  <w:style w:type="table" w:styleId="756">
     <w:name w:val="Grid Table 3 - Accent 3"/>
-    <w:basedOn w:val="11"/>
+    <w:basedOn w:val="731"/>
     <w:uiPriority w:val="99"/>
     <w:pPr>
       <w:pBdr/>
@@ -19811,29 +19804,6 @@
         <w:tblBorders/>
       </w:tblPr>
       <w:tcPr>
-        <w:shd w:color="ffffff"/>
-        <w:tcBorders>
-          <w:top w:val="none" w:color="000000" w:sz="4" w:space="0"/>
-          <w:left w:val="none" w:color="000000" w:sz="4" w:space="0"/>
-          <w:bottom w:val="none" w:color="000000" w:sz="4" w:space="0"/>
-          <w:right w:val="none" w:color="000000" w:sz="4" w:space="0"/>
-        </w:tcBorders>
-      </w:tcPr>
-    </w:tblStylePr>
-    <w:tblStylePr w:type="firstRow">
-      <w:rPr>
-        <w:b/>
-        <w:color w:val="404040"/>
-      </w:rPr>
-      <w:pPr>
-        <w:pBdr/>
-        <w:spacing/>
-        <w:ind/>
-      </w:pPr>
-      <w:tblPr>
-        <w:tblBorders/>
-      </w:tblPr>
-      <w:tcPr>
         <w:shd w:val="clear" w:color="ffffff"/>
         <w:tcBorders>
           <w:top w:val="none" w:color="000000" w:sz="4" w:space="0"/>
@@ -19843,30 +19813,7 @@
         </w:tcBorders>
       </w:tcPr>
     </w:tblStylePr>
-    <w:tblStylePr w:type="lastCol">
-      <w:rPr>
-        <w:i/>
-        <w:color w:val="404040"/>
-      </w:rPr>
-      <w:pPr>
-        <w:pBdr/>
-        <w:spacing/>
-        <w:ind/>
-      </w:pPr>
-      <w:tblPr>
-        <w:tblBorders/>
-      </w:tblPr>
-      <w:tcPr>
-        <w:shd w:color="ffffff"/>
-        <w:tcBorders>
-          <w:top w:val="none" w:color="000000" w:sz="4" w:space="0"/>
-          <w:left w:val="none" w:color="000000" w:sz="4" w:space="0"/>
-          <w:bottom w:val="none" w:color="000000" w:sz="4" w:space="0"/>
-          <w:right w:val="none" w:color="000000" w:sz="4" w:space="0"/>
-        </w:tcBorders>
-      </w:tcPr>
-    </w:tblStylePr>
-    <w:tblStylePr w:type="lastRow">
+    <w:tblStylePr w:type="firstRow">
       <w:rPr>
         <w:b/>
         <w:color w:val="404040"/>
@@ -19889,6 +19836,52 @@
         </w:tcBorders>
       </w:tcPr>
     </w:tblStylePr>
+    <w:tblStylePr w:type="lastCol">
+      <w:rPr>
+        <w:i/>
+        <w:color w:val="404040"/>
+      </w:rPr>
+      <w:pPr>
+        <w:pBdr/>
+        <w:spacing/>
+        <w:ind/>
+      </w:pPr>
+      <w:tblPr>
+        <w:tblBorders/>
+      </w:tblPr>
+      <w:tcPr>
+        <w:shd w:val="clear" w:color="ffffff"/>
+        <w:tcBorders>
+          <w:top w:val="none" w:color="000000" w:sz="4" w:space="0"/>
+          <w:left w:val="none" w:color="000000" w:sz="4" w:space="0"/>
+          <w:bottom w:val="none" w:color="000000" w:sz="4" w:space="0"/>
+          <w:right w:val="none" w:color="000000" w:sz="4" w:space="0"/>
+        </w:tcBorders>
+      </w:tcPr>
+    </w:tblStylePr>
+    <w:tblStylePr w:type="lastRow">
+      <w:rPr>
+        <w:b/>
+        <w:color w:val="404040"/>
+      </w:rPr>
+      <w:pPr>
+        <w:pBdr/>
+        <w:spacing/>
+        <w:ind/>
+      </w:pPr>
+      <w:tblPr>
+        <w:tblBorders/>
+      </w:tblPr>
+      <w:tcPr>
+        <w:shd w:val="clear" w:color="ffffff"/>
+        <w:tcBorders>
+          <w:top w:val="none" w:color="000000" w:sz="4" w:space="0"/>
+          <w:left w:val="none" w:color="000000" w:sz="4" w:space="0"/>
+          <w:bottom w:val="none" w:color="000000" w:sz="4" w:space="0"/>
+          <w:right w:val="none" w:color="000000" w:sz="4" w:space="0"/>
+        </w:tcBorders>
+      </w:tcPr>
+    </w:tblStylePr>
     <w:tblStylePr w:type="nwCell">
       <w:pPr>
         <w:pBdr/>
@@ -19955,9 +19948,9 @@
       </w:tcPr>
     </w:tblStylePr>
   </w:style>
-  <w:style w:type="table" w:styleId="37">
+  <w:style w:type="table" w:styleId="757">
     <w:name w:val="Grid Table 3 - Accent 4"/>
-    <w:basedOn w:val="11"/>
+    <w:basedOn w:val="731"/>
     <w:uiPriority w:val="99"/>
     <w:pPr>
       <w:pBdr/>
@@ -20056,29 +20049,6 @@
         <w:tblBorders/>
       </w:tblPr>
       <w:tcPr>
-        <w:shd w:color="ffffff"/>
-        <w:tcBorders>
-          <w:top w:val="none" w:color="000000" w:sz="4" w:space="0"/>
-          <w:left w:val="none" w:color="000000" w:sz="4" w:space="0"/>
-          <w:bottom w:val="none" w:color="000000" w:sz="4" w:space="0"/>
-          <w:right w:val="none" w:color="000000" w:sz="4" w:space="0"/>
-        </w:tcBorders>
-      </w:tcPr>
-    </w:tblStylePr>
-    <w:tblStylePr w:type="firstRow">
-      <w:rPr>
-        <w:b/>
-        <w:color w:val="404040"/>
-      </w:rPr>
-      <w:pPr>
-        <w:pBdr/>
-        <w:spacing/>
-        <w:ind/>
-      </w:pPr>
-      <w:tblPr>
-        <w:tblBorders/>
-      </w:tblPr>
-      <w:tcPr>
         <w:shd w:val="clear" w:color="ffffff"/>
         <w:tcBorders>
           <w:top w:val="none" w:color="000000" w:sz="4" w:space="0"/>
@@ -20088,30 +20058,7 @@
         </w:tcBorders>
       </w:tcPr>
     </w:tblStylePr>
-    <w:tblStylePr w:type="lastCol">
-      <w:rPr>
-        <w:i/>
-        <w:color w:val="404040"/>
-      </w:rPr>
-      <w:pPr>
-        <w:pBdr/>
-        <w:spacing/>
-        <w:ind/>
-      </w:pPr>
-      <w:tblPr>
-        <w:tblBorders/>
-      </w:tblPr>
-      <w:tcPr>
-        <w:shd w:color="ffffff"/>
-        <w:tcBorders>
-          <w:top w:val="none" w:color="000000" w:sz="4" w:space="0"/>
-          <w:left w:val="none" w:color="000000" w:sz="4" w:space="0"/>
-          <w:bottom w:val="none" w:color="000000" w:sz="4" w:space="0"/>
-          <w:right w:val="none" w:color="000000" w:sz="4" w:space="0"/>
-        </w:tcBorders>
-      </w:tcPr>
-    </w:tblStylePr>
-    <w:tblStylePr w:type="lastRow">
+    <w:tblStylePr w:type="firstRow">
       <w:rPr>
         <w:b/>
         <w:color w:val="404040"/>
@@ -20134,6 +20081,52 @@
         </w:tcBorders>
       </w:tcPr>
     </w:tblStylePr>
+    <w:tblStylePr w:type="lastCol">
+      <w:rPr>
+        <w:i/>
+        <w:color w:val="404040"/>
+      </w:rPr>
+      <w:pPr>
+        <w:pBdr/>
+        <w:spacing/>
+        <w:ind/>
+      </w:pPr>
+      <w:tblPr>
+        <w:tblBorders/>
+      </w:tblPr>
+      <w:tcPr>
+        <w:shd w:val="clear" w:color="ffffff"/>
+        <w:tcBorders>
+          <w:top w:val="none" w:color="000000" w:sz="4" w:space="0"/>
+          <w:left w:val="none" w:color="000000" w:sz="4" w:space="0"/>
+          <w:bottom w:val="none" w:color="000000" w:sz="4" w:space="0"/>
+          <w:right w:val="none" w:color="000000" w:sz="4" w:space="0"/>
+        </w:tcBorders>
+      </w:tcPr>
+    </w:tblStylePr>
+    <w:tblStylePr w:type="lastRow">
+      <w:rPr>
+        <w:b/>
+        <w:color w:val="404040"/>
+      </w:rPr>
+      <w:pPr>
+        <w:pBdr/>
+        <w:spacing/>
+        <w:ind/>
+      </w:pPr>
+      <w:tblPr>
+        <w:tblBorders/>
+      </w:tblPr>
+      <w:tcPr>
+        <w:shd w:val="clear" w:color="ffffff"/>
+        <w:tcBorders>
+          <w:top w:val="none" w:color="000000" w:sz="4" w:space="0"/>
+          <w:left w:val="none" w:color="000000" w:sz="4" w:space="0"/>
+          <w:bottom w:val="none" w:color="000000" w:sz="4" w:space="0"/>
+          <w:right w:val="none" w:color="000000" w:sz="4" w:space="0"/>
+        </w:tcBorders>
+      </w:tcPr>
+    </w:tblStylePr>
     <w:tblStylePr w:type="nwCell">
       <w:pPr>
         <w:pBdr/>
@@ -20200,9 +20193,9 @@
       </w:tcPr>
     </w:tblStylePr>
   </w:style>
-  <w:style w:type="table" w:styleId="38">
+  <w:style w:type="table" w:styleId="758">
     <w:name w:val="Grid Table 3 - Accent 5"/>
-    <w:basedOn w:val="11"/>
+    <w:basedOn w:val="731"/>
     <w:uiPriority w:val="99"/>
     <w:pPr>
       <w:pBdr/>
@@ -20301,29 +20294,6 @@
         <w:tblBorders/>
       </w:tblPr>
       <w:tcPr>
-        <w:shd w:color="ffffff"/>
-        <w:tcBorders>
-          <w:top w:val="none" w:color="000000" w:sz="4" w:space="0"/>
-          <w:left w:val="none" w:color="000000" w:sz="4" w:space="0"/>
-          <w:bottom w:val="none" w:color="000000" w:sz="4" w:space="0"/>
-          <w:right w:val="none" w:color="000000" w:sz="4" w:space="0"/>
-        </w:tcBorders>
-      </w:tcPr>
-    </w:tblStylePr>
-    <w:tblStylePr w:type="firstRow">
-      <w:rPr>
-        <w:b/>
-        <w:color w:val="404040"/>
-      </w:rPr>
-      <w:pPr>
-        <w:pBdr/>
-        <w:spacing/>
-        <w:ind/>
-      </w:pPr>
-      <w:tblPr>
-        <w:tblBorders/>
-      </w:tblPr>
-      <w:tcPr>
         <w:shd w:val="clear" w:color="ffffff"/>
         <w:tcBorders>
           <w:top w:val="none" w:color="000000" w:sz="4" w:space="0"/>
@@ -20333,30 +20303,7 @@
         </w:tcBorders>
       </w:tcPr>
     </w:tblStylePr>
-    <w:tblStylePr w:type="lastCol">
-      <w:rPr>
-        <w:i/>
-        <w:color w:val="404040"/>
-      </w:rPr>
-      <w:pPr>
-        <w:pBdr/>
-        <w:spacing/>
-        <w:ind/>
-      </w:pPr>
-      <w:tblPr>
-        <w:tblBorders/>
-      </w:tblPr>
-      <w:tcPr>
-        <w:shd w:color="ffffff"/>
-        <w:tcBorders>
-          <w:top w:val="none" w:color="000000" w:sz="4" w:space="0"/>
-          <w:left w:val="none" w:color="000000" w:sz="4" w:space="0"/>
-          <w:bottom w:val="none" w:color="000000" w:sz="4" w:space="0"/>
-          <w:right w:val="none" w:color="000000" w:sz="4" w:space="0"/>
-        </w:tcBorders>
-      </w:tcPr>
-    </w:tblStylePr>
-    <w:tblStylePr w:type="lastRow">
+    <w:tblStylePr w:type="firstRow">
       <w:rPr>
         <w:b/>
         <w:color w:val="404040"/>
@@ -20379,6 +20326,52 @@
         </w:tcBorders>
       </w:tcPr>
     </w:tblStylePr>
+    <w:tblStylePr w:type="lastCol">
+      <w:rPr>
+        <w:i/>
+        <w:color w:val="404040"/>
+      </w:rPr>
+      <w:pPr>
+        <w:pBdr/>
+        <w:spacing/>
+        <w:ind/>
+      </w:pPr>
+      <w:tblPr>
+        <w:tblBorders/>
+      </w:tblPr>
+      <w:tcPr>
+        <w:shd w:val="clear" w:color="ffffff"/>
+        <w:tcBorders>
+          <w:top w:val="none" w:color="000000" w:sz="4" w:space="0"/>
+          <w:left w:val="none" w:color="000000" w:sz="4" w:space="0"/>
+          <w:bottom w:val="none" w:color="000000" w:sz="4" w:space="0"/>
+          <w:right w:val="none" w:color="000000" w:sz="4" w:space="0"/>
+        </w:tcBorders>
+      </w:tcPr>
+    </w:tblStylePr>
+    <w:tblStylePr w:type="lastRow">
+      <w:rPr>
+        <w:b/>
+        <w:color w:val="404040"/>
+      </w:rPr>
+      <w:pPr>
+        <w:pBdr/>
+        <w:spacing/>
+        <w:ind/>
+      </w:pPr>
+      <w:tblPr>
+        <w:tblBorders/>
+      </w:tblPr>
+      <w:tcPr>
+        <w:shd w:val="clear" w:color="ffffff"/>
+        <w:tcBorders>
+          <w:top w:val="none" w:color="000000" w:sz="4" w:space="0"/>
+          <w:left w:val="none" w:color="000000" w:sz="4" w:space="0"/>
+          <w:bottom w:val="none" w:color="000000" w:sz="4" w:space="0"/>
+          <w:right w:val="none" w:color="000000" w:sz="4" w:space="0"/>
+        </w:tcBorders>
+      </w:tcPr>
+    </w:tblStylePr>
     <w:tblStylePr w:type="nwCell">
       <w:pPr>
         <w:pBdr/>
@@ -20445,9 +20438,9 @@
       </w:tcPr>
     </w:tblStylePr>
   </w:style>
-  <w:style w:type="table" w:styleId="39">
+  <w:style w:type="table" w:styleId="759">
     <w:name w:val="Grid Table 3 - Accent 6"/>
-    <w:basedOn w:val="11"/>
+    <w:basedOn w:val="731"/>
     <w:uiPriority w:val="99"/>
     <w:pPr>
       <w:pBdr/>
@@ -20546,29 +20539,6 @@
         <w:tblBorders/>
       </w:tblPr>
       <w:tcPr>
-        <w:shd w:color="ffffff"/>
-        <w:tcBorders>
-          <w:top w:val="none" w:color="000000" w:sz="4" w:space="0"/>
-          <w:left w:val="none" w:color="000000" w:sz="4" w:space="0"/>
-          <w:bottom w:val="none" w:color="000000" w:sz="4" w:space="0"/>
-          <w:right w:val="none" w:color="000000" w:sz="4" w:space="0"/>
-        </w:tcBorders>
-      </w:tcPr>
-    </w:tblStylePr>
-    <w:tblStylePr w:type="firstRow">
-      <w:rPr>
-        <w:b/>
-        <w:color w:val="404040"/>
-      </w:rPr>
-      <w:pPr>
-        <w:pBdr/>
-        <w:spacing/>
-        <w:ind/>
-      </w:pPr>
-      <w:tblPr>
-        <w:tblBorders/>
-      </w:tblPr>
-      <w:tcPr>
         <w:shd w:val="clear" w:color="ffffff"/>
         <w:tcBorders>
           <w:top w:val="none" w:color="000000" w:sz="4" w:space="0"/>
@@ -20578,30 +20548,7 @@
         </w:tcBorders>
       </w:tcPr>
     </w:tblStylePr>
-    <w:tblStylePr w:type="lastCol">
-      <w:rPr>
-        <w:i/>
-        <w:color w:val="404040"/>
-      </w:rPr>
-      <w:pPr>
-        <w:pBdr/>
-        <w:spacing/>
-        <w:ind/>
-      </w:pPr>
-      <w:tblPr>
-        <w:tblBorders/>
-      </w:tblPr>
-      <w:tcPr>
-        <w:shd w:color="ffffff"/>
-        <w:tcBorders>
-          <w:top w:val="none" w:color="000000" w:sz="4" w:space="0"/>
-          <w:left w:val="none" w:color="000000" w:sz="4" w:space="0"/>
-          <w:bottom w:val="none" w:color="000000" w:sz="4" w:space="0"/>
-          <w:right w:val="none" w:color="000000" w:sz="4" w:space="0"/>
-        </w:tcBorders>
-      </w:tcPr>
-    </w:tblStylePr>
-    <w:tblStylePr w:type="lastRow">
+    <w:tblStylePr w:type="firstRow">
       <w:rPr>
         <w:b/>
         <w:color w:val="404040"/>
@@ -20624,6 +20571,52 @@
         </w:tcBorders>
       </w:tcPr>
     </w:tblStylePr>
+    <w:tblStylePr w:type="lastCol">
+      <w:rPr>
+        <w:i/>
+        <w:color w:val="404040"/>
+      </w:rPr>
+      <w:pPr>
+        <w:pBdr/>
+        <w:spacing/>
+        <w:ind/>
+      </w:pPr>
+      <w:tblPr>
+        <w:tblBorders/>
+      </w:tblPr>
+      <w:tcPr>
+        <w:shd w:val="clear" w:color="ffffff"/>
+        <w:tcBorders>
+          <w:top w:val="none" w:color="000000" w:sz="4" w:space="0"/>
+          <w:left w:val="none" w:color="000000" w:sz="4" w:space="0"/>
+          <w:bottom w:val="none" w:color="000000" w:sz="4" w:space="0"/>
+          <w:right w:val="none" w:color="000000" w:sz="4" w:space="0"/>
+        </w:tcBorders>
+      </w:tcPr>
+    </w:tblStylePr>
+    <w:tblStylePr w:type="lastRow">
+      <w:rPr>
+        <w:b/>
+        <w:color w:val="404040"/>
+      </w:rPr>
+      <w:pPr>
+        <w:pBdr/>
+        <w:spacing/>
+        <w:ind/>
+      </w:pPr>
+      <w:tblPr>
+        <w:tblBorders/>
+      </w:tblPr>
+      <w:tcPr>
+        <w:shd w:val="clear" w:color="ffffff"/>
+        <w:tcBorders>
+          <w:top w:val="none" w:color="000000" w:sz="4" w:space="0"/>
+          <w:left w:val="none" w:color="000000" w:sz="4" w:space="0"/>
+          <w:bottom w:val="none" w:color="000000" w:sz="4" w:space="0"/>
+          <w:right w:val="none" w:color="000000" w:sz="4" w:space="0"/>
+        </w:tcBorders>
+      </w:tcPr>
+    </w:tblStylePr>
     <w:tblStylePr w:type="nwCell">
       <w:pPr>
         <w:pBdr/>
@@ -20690,9 +20683,9 @@
       </w:tcPr>
     </w:tblStylePr>
   </w:style>
-  <w:style w:type="table" w:styleId="40">
+  <w:style w:type="table" w:styleId="760">
     <w:name w:val="Grid Table 4"/>
-    <w:basedOn w:val="11"/>
+    <w:basedOn w:val="731"/>
     <w:uiPriority w:val="59"/>
     <w:pPr>
       <w:pBdr/>
@@ -20923,9 +20916,9 @@
       </w:tcPr>
     </w:tblStylePr>
   </w:style>
-  <w:style w:type="table" w:styleId="41">
+  <w:style w:type="table" w:styleId="761">
     <w:name w:val="Grid Table 4 - Accent 1"/>
-    <w:basedOn w:val="11"/>
+    <w:basedOn w:val="731"/>
     <w:uiPriority w:val="59"/>
     <w:pPr>
       <w:pBdr/>
@@ -21156,9 +21149,9 @@
       </w:tcPr>
     </w:tblStylePr>
   </w:style>
-  <w:style w:type="table" w:styleId="42">
+  <w:style w:type="table" w:styleId="762">
     <w:name w:val="Grid Table 4 - Accent 2"/>
-    <w:basedOn w:val="11"/>
+    <w:basedOn w:val="731"/>
     <w:uiPriority w:val="59"/>
     <w:pPr>
       <w:pBdr/>
@@ -21389,9 +21382,9 @@
       </w:tcPr>
     </w:tblStylePr>
   </w:style>
-  <w:style w:type="table" w:styleId="43">
+  <w:style w:type="table" w:styleId="763">
     <w:name w:val="Grid Table 4 - Accent 3"/>
-    <w:basedOn w:val="11"/>
+    <w:basedOn w:val="731"/>
     <w:uiPriority w:val="59"/>
     <w:pPr>
       <w:pBdr/>
@@ -21622,9 +21615,9 @@
       </w:tcPr>
     </w:tblStylePr>
   </w:style>
-  <w:style w:type="table" w:styleId="44">
+  <w:style w:type="table" w:styleId="764">
     <w:name w:val="Grid Table 4 - Accent 4"/>
-    <w:basedOn w:val="11"/>
+    <w:basedOn w:val="731"/>
     <w:uiPriority w:val="59"/>
     <w:pPr>
       <w:pBdr/>
@@ -21855,9 +21848,9 @@
       </w:tcPr>
     </w:tblStylePr>
   </w:style>
-  <w:style w:type="table" w:styleId="45">
+  <w:style w:type="table" w:styleId="765">
     <w:name w:val="Grid Table 4 - Accent 5"/>
-    <w:basedOn w:val="11"/>
+    <w:basedOn w:val="731"/>
     <w:uiPriority w:val="59"/>
     <w:pPr>
       <w:pBdr/>
@@ -22088,9 +22081,9 @@
       </w:tcPr>
     </w:tblStylePr>
   </w:style>
-  <w:style w:type="table" w:styleId="46">
+  <w:style w:type="table" w:styleId="766">
     <w:name w:val="Grid Table 4 - Accent 6"/>
-    <w:basedOn w:val="11"/>
+    <w:basedOn w:val="731"/>
     <w:uiPriority w:val="59"/>
     <w:pPr>
       <w:pBdr/>
@@ -22321,9 +22314,9 @@
       </w:tcPr>
     </w:tblStylePr>
   </w:style>
-  <w:style w:type="table" w:styleId="47">
+  <w:style w:type="table" w:styleId="767">
     <w:name w:val="Grid Table 5 Dark"/>
-    <w:basedOn w:val="11"/>
+    <w:basedOn w:val="731"/>
     <w:uiPriority w:val="99"/>
     <w:pPr>
       <w:pBdr/>
@@ -22549,9 +22542,9 @@
       </w:tcPr>
     </w:tblStylePr>
   </w:style>
-  <w:style w:type="table" w:styleId="48">
+  <w:style w:type="table" w:styleId="768">
     <w:name w:val="Grid Table 5 Dark- Accent 1"/>
-    <w:basedOn w:val="11"/>
+    <w:basedOn w:val="731"/>
     <w:uiPriority w:val="99"/>
     <w:pPr>
       <w:pBdr/>
@@ -22777,9 +22770,9 @@
       </w:tcPr>
     </w:tblStylePr>
   </w:style>
-  <w:style w:type="table" w:styleId="49">
+  <w:style w:type="table" w:styleId="769">
     <w:name w:val="Grid Table 5 Dark - Accent 2"/>
-    <w:basedOn w:val="11"/>
+    <w:basedOn w:val="731"/>
     <w:uiPriority w:val="99"/>
     <w:pPr>
       <w:pBdr/>
@@ -23005,9 +22998,9 @@
       </w:tcPr>
     </w:tblStylePr>
   </w:style>
-  <w:style w:type="table" w:styleId="50">
+  <w:style w:type="table" w:styleId="770">
     <w:name w:val="Grid Table 5 Dark - Accent 3"/>
-    <w:basedOn w:val="11"/>
+    <w:basedOn w:val="731"/>
     <w:uiPriority w:val="99"/>
     <w:pPr>
       <w:pBdr/>
@@ -23233,9 +23226,9 @@
       </w:tcPr>
     </w:tblStylePr>
   </w:style>
-  <w:style w:type="table" w:styleId="51">
+  <w:style w:type="table" w:styleId="771">
     <w:name w:val="Grid Table 5 Dark- Accent 4"/>
-    <w:basedOn w:val="11"/>
+    <w:basedOn w:val="731"/>
     <w:uiPriority w:val="99"/>
     <w:pPr>
       <w:pBdr/>
@@ -23461,9 +23454,9 @@
       </w:tcPr>
     </w:tblStylePr>
   </w:style>
-  <w:style w:type="table" w:styleId="52">
+  <w:style w:type="table" w:styleId="772">
     <w:name w:val="Grid Table 5 Dark - Accent 5"/>
-    <w:basedOn w:val="11"/>
+    <w:basedOn w:val="731"/>
     <w:uiPriority w:val="99"/>
     <w:pPr>
       <w:pBdr/>
@@ -23689,9 +23682,9 @@
       </w:tcPr>
     </w:tblStylePr>
   </w:style>
-  <w:style w:type="table" w:styleId="53">
+  <w:style w:type="table" w:styleId="773">
     <w:name w:val="Grid Table 5 Dark - Accent 6"/>
-    <w:basedOn w:val="11"/>
+    <w:basedOn w:val="731"/>
     <w:uiPriority w:val="99"/>
     <w:pPr>
       <w:pBdr/>
@@ -23917,9 +23910,9 @@
       </w:tcPr>
     </w:tblStylePr>
   </w:style>
-  <w:style w:type="table" w:styleId="54">
+  <w:style w:type="table" w:styleId="774">
     <w:name w:val="Grid Table 6 Colorful"/>
-    <w:basedOn w:val="11"/>
+    <w:basedOn w:val="731"/>
     <w:uiPriority w:val="99"/>
     <w:pPr>
       <w:pBdr/>
@@ -24147,9 +24140,9 @@
       </w:tcPr>
     </w:tblStylePr>
   </w:style>
-  <w:style w:type="table" w:styleId="55">
+  <w:style w:type="table" w:styleId="775">
     <w:name w:val="Grid Table 6 Colorful - Accent 1"/>
-    <w:basedOn w:val="11"/>
+    <w:basedOn w:val="731"/>
     <w:uiPriority w:val="99"/>
     <w:pPr>
       <w:pBdr/>
@@ -24377,9 +24370,9 @@
       </w:tcPr>
     </w:tblStylePr>
   </w:style>
-  <w:style w:type="table" w:styleId="56">
+  <w:style w:type="table" w:styleId="776">
     <w:name w:val="Grid Table 6 Colorful - Accent 2"/>
-    <w:basedOn w:val="11"/>
+    <w:basedOn w:val="731"/>
     <w:uiPriority w:val="99"/>
     <w:pPr>
       <w:pBdr/>
@@ -24607,9 +24600,9 @@
       </w:tcPr>
     </w:tblStylePr>
   </w:style>
-  <w:style w:type="table" w:styleId="57">
+  <w:style w:type="table" w:styleId="777">
     <w:name w:val="Grid Table 6 Colorful - Accent 3"/>
-    <w:basedOn w:val="11"/>
+    <w:basedOn w:val="731"/>
     <w:uiPriority w:val="99"/>
     <w:pPr>
       <w:pBdr/>
@@ -24837,9 +24830,9 @@
       </w:tcPr>
     </w:tblStylePr>
   </w:style>
-  <w:style w:type="table" w:styleId="58">
+  <w:style w:type="table" w:styleId="778">
     <w:name w:val="Grid Table 6 Colorful - Accent 4"/>
-    <w:basedOn w:val="11"/>
+    <w:basedOn w:val="731"/>
     <w:uiPriority w:val="99"/>
     <w:pPr>
       <w:pBdr/>
@@ -25067,9 +25060,9 @@
       </w:tcPr>
     </w:tblStylePr>
   </w:style>
-  <w:style w:type="table" w:styleId="59">
+  <w:style w:type="table" w:styleId="779">
     <w:name w:val="Grid Table 6 Colorful - Accent 5"/>
-    <w:basedOn w:val="11"/>
+    <w:basedOn w:val="731"/>
     <w:uiPriority w:val="99"/>
     <w:pPr>
       <w:pBdr/>
@@ -25297,9 +25290,9 @@
       </w:tcPr>
     </w:tblStylePr>
   </w:style>
-  <w:style w:type="table" w:styleId="60">
+  <w:style w:type="table" w:styleId="780">
     <w:name w:val="Grid Table 6 Colorful - Accent 6"/>
-    <w:basedOn w:val="11"/>
+    <w:basedOn w:val="731"/>
     <w:uiPriority w:val="99"/>
     <w:pPr>
       <w:pBdr/>
@@ -25527,9 +25520,9 @@
       </w:tcPr>
     </w:tblStylePr>
   </w:style>
-  <w:style w:type="table" w:styleId="61">
+  <w:style w:type="table" w:styleId="781">
     <w:name w:val="Grid Table 7 Colorful"/>
-    <w:basedOn w:val="11"/>
+    <w:basedOn w:val="731"/>
     <w:uiPriority w:val="99"/>
     <w:pPr>
       <w:pBdr/>
@@ -25631,11 +25624,11 @@
         <w:tblBorders/>
       </w:tblPr>
       <w:tcPr>
-        <w:shd w:color="ffffff"/>
+        <w:shd w:val="clear" w:color="ffffff"/>
         <w:tcBorders>
-          <w:top w:val="none"/>
-          <w:left w:val="none"/>
-          <w:bottom w:val="none"/>
+          <w:top w:val="none" w:color="000000" w:sz="4" w:space="0"/>
+          <w:left w:val="none" w:color="000000" w:sz="4" w:space="0"/>
+          <w:bottom w:val="none" w:color="000000" w:sz="4" w:space="0"/>
           <w:right w:val="single" w:color="000000" w:themeColor="text1" w:themeTint="80" w:sz="4" w:space="0"/>
         </w:tcBorders>
       </w:tcPr>
@@ -25658,10 +25651,10 @@
       <w:tcPr>
         <w:shd w:val="clear" w:color="ffffff" w:themeColor="light1" w:fill="ffffff" w:themeFill="light1"/>
         <w:tcBorders>
-          <w:top w:val="none"/>
-          <w:left w:val="none"/>
+          <w:top w:val="none" w:color="000000" w:sz="4" w:space="0"/>
+          <w:left w:val="none" w:color="000000" w:sz="4" w:space="0"/>
           <w:bottom w:val="single" w:color="000000" w:themeColor="text1" w:themeTint="80" w:sz="4" w:space="0"/>
-          <w:right w:val="none"/>
+          <w:right w:val="none" w:color="000000" w:sz="4" w:space="0"/>
         </w:tcBorders>
       </w:tcPr>
     </w:tblStylePr>
@@ -25681,12 +25674,12 @@
         <w:tblBorders/>
       </w:tblPr>
       <w:tcPr>
-        <w:shd w:color="ffffff"/>
+        <w:shd w:val="clear" w:color="ffffff"/>
         <w:tcBorders>
-          <w:top w:val="none"/>
+          <w:top w:val="none" w:color="000000" w:sz="4" w:space="0"/>
           <w:left w:val="single" w:color="000000" w:themeColor="text1" w:themeTint="80" w:sz="4" w:space="0"/>
-          <w:bottom w:val="none"/>
-          <w:right w:val="none"/>
+          <w:bottom w:val="none" w:color="000000" w:sz="4" w:space="0"/>
+          <w:right w:val="none" w:color="000000" w:sz="4" w:space="0"/>
         </w:tcBorders>
       </w:tcPr>
     </w:tblStylePr>
@@ -25709,9 +25702,9 @@
         <w:shd w:val="clear" w:color="ffffff" w:themeColor="light1" w:fill="ffffff" w:themeFill="light1"/>
         <w:tcBorders>
           <w:top w:val="single" w:color="000000" w:themeColor="text1" w:themeTint="80" w:sz="4" w:space="0"/>
-          <w:left w:val="none"/>
-          <w:bottom w:val="none"/>
-          <w:right w:val="none"/>
+          <w:left w:val="none" w:color="000000" w:sz="4" w:space="0"/>
+          <w:bottom w:val="none" w:color="000000" w:sz="4" w:space="0"/>
+          <w:right w:val="none" w:color="000000" w:sz="4" w:space="0"/>
         </w:tcBorders>
       </w:tcPr>
     </w:tblStylePr>
@@ -25781,9 +25774,9 @@
       </w:tcPr>
     </w:tblStylePr>
   </w:style>
-  <w:style w:type="table" w:styleId="62">
+  <w:style w:type="table" w:styleId="782">
     <w:name w:val="Grid Table 7 Colorful - Accent 1"/>
-    <w:basedOn w:val="11"/>
+    <w:basedOn w:val="731"/>
     <w:uiPriority w:val="99"/>
     <w:pPr>
       <w:pBdr/>
@@ -25885,11 +25878,11 @@
         <w:tblBorders/>
       </w:tblPr>
       <w:tcPr>
-        <w:shd w:color="ffffff"/>
+        <w:shd w:val="clear" w:color="ffffff"/>
         <w:tcBorders>
-          <w:top w:val="none"/>
-          <w:left w:val="none"/>
-          <w:bottom w:val="none"/>
+          <w:top w:val="none" w:color="000000" w:sz="4" w:space="0"/>
+          <w:left w:val="none" w:color="000000" w:sz="4" w:space="0"/>
+          <w:bottom w:val="none" w:color="000000" w:sz="4" w:space="0"/>
           <w:right w:val="single" w:color="000000" w:themeColor="accent1" w:themeTint="80" w:sz="4" w:space="0"/>
         </w:tcBorders>
       </w:tcPr>
@@ -25912,10 +25905,10 @@
       <w:tcPr>
         <w:shd w:val="clear" w:color="ffffff" w:themeColor="light1" w:fill="ffffff" w:themeFill="light1"/>
         <w:tcBorders>
-          <w:top w:val="none"/>
-          <w:left w:val="none"/>
+          <w:top w:val="none" w:color="000000" w:sz="4" w:space="0"/>
+          <w:left w:val="none" w:color="000000" w:sz="4" w:space="0"/>
           <w:bottom w:val="single" w:color="000000" w:themeColor="accent1" w:themeTint="80" w:sz="4" w:space="0"/>
-          <w:right w:val="none"/>
+          <w:right w:val="none" w:color="000000" w:sz="4" w:space="0"/>
         </w:tcBorders>
       </w:tcPr>
     </w:tblStylePr>
@@ -25935,12 +25928,12 @@
         <w:tblBorders/>
       </w:tblPr>
       <w:tcPr>
-        <w:shd w:color="ffffff"/>
+        <w:shd w:val="clear" w:color="ffffff"/>
         <w:tcBorders>
-          <w:top w:val="none"/>
+          <w:top w:val="none" w:color="000000" w:sz="4" w:space="0"/>
           <w:left w:val="single" w:color="000000" w:themeColor="accent1" w:themeTint="80" w:sz="4" w:space="0"/>
-          <w:bottom w:val="none"/>
-          <w:right w:val="none"/>
+          <w:bottom w:val="none" w:color="000000" w:sz="4" w:space="0"/>
+          <w:right w:val="none" w:color="000000" w:sz="4" w:space="0"/>
         </w:tcBorders>
       </w:tcPr>
     </w:tblStylePr>
@@ -25963,9 +25956,9 @@
         <w:shd w:val="clear" w:color="ffffff" w:themeColor="light1" w:fill="ffffff" w:themeFill="light1"/>
         <w:tcBorders>
           <w:top w:val="single" w:color="000000" w:themeColor="accent1" w:themeTint="80" w:sz="4" w:space="0"/>
-          <w:left w:val="none"/>
-          <w:bottom w:val="none"/>
-          <w:right w:val="none"/>
+          <w:left w:val="none" w:color="000000" w:sz="4" w:space="0"/>
+          <w:bottom w:val="none" w:color="000000" w:sz="4" w:space="0"/>
+          <w:right w:val="none" w:color="000000" w:sz="4" w:space="0"/>
         </w:tcBorders>
       </w:tcPr>
     </w:tblStylePr>
@@ -26035,9 +26028,9 @@
       </w:tcPr>
     </w:tblStylePr>
   </w:style>
-  <w:style w:type="table" w:styleId="63">
+  <w:style w:type="table" w:styleId="783">
     <w:name w:val="Grid Table 7 Colorful - Accent 2"/>
-    <w:basedOn w:val="11"/>
+    <w:basedOn w:val="731"/>
     <w:uiPriority w:val="99"/>
     <w:pPr>
       <w:pBdr/>
@@ -26139,11 +26132,11 @@
         <w:tblBorders/>
       </w:tblPr>
       <w:tcPr>
-        <w:shd w:color="ffffff"/>
+        <w:shd w:val="clear" w:color="ffffff"/>
         <w:tcBorders>
-          <w:top w:val="none"/>
-          <w:left w:val="none"/>
-          <w:bottom w:val="none"/>
+          <w:top w:val="none" w:color="000000" w:sz="4" w:space="0"/>
+          <w:left w:val="none" w:color="000000" w:sz="4" w:space="0"/>
+          <w:bottom w:val="none" w:color="000000" w:sz="4" w:space="0"/>
           <w:right w:val="single" w:color="000000" w:themeColor="accent2" w:themeTint="97" w:sz="4" w:space="0"/>
         </w:tcBorders>
       </w:tcPr>
@@ -26166,10 +26159,10 @@
       <w:tcPr>
         <w:shd w:val="clear" w:color="ffffff" w:themeColor="light1" w:fill="ffffff" w:themeFill="light1"/>
         <w:tcBorders>
-          <w:top w:val="none"/>
-          <w:left w:val="none"/>
+          <w:top w:val="none" w:color="000000" w:sz="4" w:space="0"/>
+          <w:left w:val="none" w:color="000000" w:sz="4" w:space="0"/>
           <w:bottom w:val="single" w:color="000000" w:themeColor="accent2" w:themeTint="97" w:sz="4" w:space="0"/>
-          <w:right w:val="none"/>
+          <w:right w:val="none" w:color="000000" w:sz="4" w:space="0"/>
         </w:tcBorders>
       </w:tcPr>
     </w:tblStylePr>
@@ -26189,12 +26182,12 @@
         <w:tblBorders/>
       </w:tblPr>
       <w:tcPr>
-        <w:shd w:color="ffffff"/>
+        <w:shd w:val="clear" w:color="ffffff"/>
         <w:tcBorders>
-          <w:top w:val="none"/>
+          <w:top w:val="none" w:color="000000" w:sz="4" w:space="0"/>
           <w:left w:val="single" w:color="000000" w:themeColor="accent2" w:themeTint="97" w:sz="4" w:space="0"/>
-          <w:bottom w:val="none"/>
-          <w:right w:val="none"/>
+          <w:bottom w:val="none" w:color="000000" w:sz="4" w:space="0"/>
+          <w:right w:val="none" w:color="000000" w:sz="4" w:space="0"/>
         </w:tcBorders>
       </w:tcPr>
     </w:tblStylePr>
@@ -26217,9 +26210,9 @@
         <w:shd w:val="clear" w:color="ffffff" w:themeColor="light1" w:fill="ffffff" w:themeFill="light1"/>
         <w:tcBorders>
           <w:top w:val="single" w:color="000000" w:themeColor="accent2" w:themeTint="97" w:sz="4" w:space="0"/>
-          <w:left w:val="none"/>
-          <w:bottom w:val="none"/>
-          <w:right w:val="none"/>
+          <w:left w:val="none" w:color="000000" w:sz="4" w:space="0"/>
+          <w:bottom w:val="none" w:color="000000" w:sz="4" w:space="0"/>
+          <w:right w:val="none" w:color="000000" w:sz="4" w:space="0"/>
         </w:tcBorders>
       </w:tcPr>
     </w:tblStylePr>
@@ -26289,9 +26282,9 @@
       </w:tcPr>
     </w:tblStylePr>
   </w:style>
-  <w:style w:type="table" w:styleId="64">
+  <w:style w:type="table" w:styleId="784">
     <w:name w:val="Grid Table 7 Colorful - Accent 3"/>
-    <w:basedOn w:val="11"/>
+    <w:basedOn w:val="731"/>
     <w:uiPriority w:val="99"/>
     <w:pPr>
       <w:pBdr/>
@@ -26393,11 +26386,11 @@
         <w:tblBorders/>
       </w:tblPr>
       <w:tcPr>
-        <w:shd w:color="ffffff"/>
+        <w:shd w:val="clear" w:color="ffffff"/>
         <w:tcBorders>
-          <w:top w:val="none"/>
-          <w:left w:val="none"/>
-          <w:bottom w:val="none"/>
+          <w:top w:val="none" w:color="000000" w:sz="4" w:space="0"/>
+          <w:left w:val="none" w:color="000000" w:sz="4" w:space="0"/>
+          <w:bottom w:val="none" w:color="000000" w:sz="4" w:space="0"/>
           <w:right w:val="single" w:color="000000" w:themeColor="accent3" w:themeTint="FE" w:sz="4" w:space="0"/>
         </w:tcBorders>
       </w:tcPr>
@@ -26420,10 +26413,10 @@
       <w:tcPr>
         <w:shd w:val="clear" w:color="ffffff" w:themeColor="light1" w:fill="ffffff" w:themeFill="light1"/>
         <w:tcBorders>
-          <w:top w:val="none"/>
-          <w:left w:val="none"/>
+          <w:top w:val="none" w:color="000000" w:sz="4" w:space="0"/>
+          <w:left w:val="none" w:color="000000" w:sz="4" w:space="0"/>
           <w:bottom w:val="single" w:color="000000" w:themeColor="accent3" w:themeTint="FE" w:sz="4" w:space="0"/>
-          <w:right w:val="none"/>
+          <w:right w:val="none" w:color="000000" w:sz="4" w:space="0"/>
         </w:tcBorders>
       </w:tcPr>
     </w:tblStylePr>
@@ -26443,12 +26436,12 @@
         <w:tblBorders/>
       </w:tblPr>
       <w:tcPr>
-        <w:shd w:color="ffffff"/>
+        <w:shd w:val="clear" w:color="ffffff"/>
         <w:tcBorders>
-          <w:top w:val="none"/>
+          <w:top w:val="none" w:color="000000" w:sz="4" w:space="0"/>
           <w:left w:val="single" w:color="000000" w:themeColor="accent3" w:themeTint="FE" w:sz="4" w:space="0"/>
-          <w:bottom w:val="none"/>
-          <w:right w:val="none"/>
+          <w:bottom w:val="none" w:color="000000" w:sz="4" w:space="0"/>
+          <w:right w:val="none" w:color="000000" w:sz="4" w:space="0"/>
         </w:tcBorders>
       </w:tcPr>
     </w:tblStylePr>
@@ -26471,9 +26464,9 @@
         <w:shd w:val="clear" w:color="ffffff" w:themeColor="light1" w:fill="ffffff" w:themeFill="light1"/>
         <w:tcBorders>
           <w:top w:val="single" w:color="000000" w:themeColor="accent3" w:themeTint="FE" w:sz="4" w:space="0"/>
-          <w:left w:val="none"/>
-          <w:bottom w:val="none"/>
-          <w:right w:val="none"/>
+          <w:left w:val="none" w:color="000000" w:sz="4" w:space="0"/>
+          <w:bottom w:val="none" w:color="000000" w:sz="4" w:space="0"/>
+          <w:right w:val="none" w:color="000000" w:sz="4" w:space="0"/>
         </w:tcBorders>
       </w:tcPr>
     </w:tblStylePr>
@@ -26543,9 +26536,9 @@
       </w:tcPr>
     </w:tblStylePr>
   </w:style>
-  <w:style w:type="table" w:styleId="65">
+  <w:style w:type="table" w:styleId="785">
     <w:name w:val="Grid Table 7 Colorful - Accent 4"/>
-    <w:basedOn w:val="11"/>
+    <w:basedOn w:val="731"/>
     <w:uiPriority w:val="99"/>
     <w:pPr>
       <w:pBdr/>
@@ -26647,11 +26640,11 @@
         <w:tblBorders/>
       </w:tblPr>
       <w:tcPr>
-        <w:shd w:color="ffffff"/>
+        <w:shd w:val="clear" w:color="ffffff"/>
         <w:tcBorders>
-          <w:top w:val="none"/>
-          <w:left w:val="none"/>
-          <w:bottom w:val="none"/>
+          <w:top w:val="none" w:color="000000" w:sz="4" w:space="0"/>
+          <w:left w:val="none" w:color="000000" w:sz="4" w:space="0"/>
+          <w:bottom w:val="none" w:color="000000" w:sz="4" w:space="0"/>
           <w:right w:val="single" w:color="000000" w:themeColor="accent4" w:themeTint="9A" w:sz="4" w:space="0"/>
         </w:tcBorders>
       </w:tcPr>
@@ -26674,10 +26667,10 @@
       <w:tcPr>
         <w:shd w:val="clear" w:color="ffffff" w:themeColor="light1" w:fill="ffffff" w:themeFill="light1"/>
         <w:tcBorders>
-          <w:top w:val="none"/>
-          <w:left w:val="none"/>
+          <w:top w:val="none" w:color="000000" w:sz="4" w:space="0"/>
+          <w:left w:val="none" w:color="000000" w:sz="4" w:space="0"/>
           <w:bottom w:val="single" w:color="000000" w:themeColor="accent4" w:themeTint="9A" w:sz="4" w:space="0"/>
-          <w:right w:val="none"/>
+          <w:right w:val="none" w:color="000000" w:sz="4" w:space="0"/>
         </w:tcBorders>
       </w:tcPr>
     </w:tblStylePr>
@@ -26697,12 +26690,12 @@
         <w:tblBorders/>
       </w:tblPr>
       <w:tcPr>
-        <w:shd w:color="ffffff"/>
+        <w:shd w:val="clear" w:color="ffffff"/>
         <w:tcBorders>
-          <w:top w:val="none"/>
+          <w:top w:val="none" w:color="000000" w:sz="4" w:space="0"/>
           <w:left w:val="single" w:color="000000" w:themeColor="accent4" w:themeTint="9A" w:sz="4" w:space="0"/>
-          <w:bottom w:val="none"/>
-          <w:right w:val="none"/>
+          <w:bottom w:val="none" w:color="000000" w:sz="4" w:space="0"/>
+          <w:right w:val="none" w:color="000000" w:sz="4" w:space="0"/>
         </w:tcBorders>
       </w:tcPr>
     </w:tblStylePr>
@@ -26725,9 +26718,9 @@
         <w:shd w:val="clear" w:color="ffffff" w:themeColor="light1" w:fill="ffffff" w:themeFill="light1"/>
         <w:tcBorders>
           <w:top w:val="single" w:color="000000" w:themeColor="accent4" w:themeTint="9A" w:sz="4" w:space="0"/>
-          <w:left w:val="none"/>
-          <w:bottom w:val="none"/>
-          <w:right w:val="none"/>
+          <w:left w:val="none" w:color="000000" w:sz="4" w:space="0"/>
+          <w:bottom w:val="none" w:color="000000" w:sz="4" w:space="0"/>
+          <w:right w:val="none" w:color="000000" w:sz="4" w:space="0"/>
         </w:tcBorders>
       </w:tcPr>
     </w:tblStylePr>
@@ -26797,9 +26790,9 @@
       </w:tcPr>
     </w:tblStylePr>
   </w:style>
-  <w:style w:type="table" w:styleId="66">
+  <w:style w:type="table" w:styleId="786">
     <w:name w:val="Grid Table 7 Colorful - Accent 5"/>
-    <w:basedOn w:val="11"/>
+    <w:basedOn w:val="731"/>
     <w:uiPriority w:val="99"/>
     <w:pPr>
       <w:pBdr/>
@@ -26901,11 +26894,11 @@
         <w:tblBorders/>
       </w:tblPr>
       <w:tcPr>
-        <w:shd w:color="ffffff"/>
+        <w:shd w:val="clear" w:color="ffffff"/>
         <w:tcBorders>
-          <w:top w:val="none"/>
-          <w:left w:val="none"/>
-          <w:bottom w:val="none"/>
+          <w:top w:val="none" w:color="000000" w:sz="4" w:space="0"/>
+          <w:left w:val="none" w:color="000000" w:sz="4" w:space="0"/>
+          <w:bottom w:val="none" w:color="000000" w:sz="4" w:space="0"/>
           <w:right w:val="single" w:color="000000" w:themeColor="accent5" w:themeTint="90" w:sz="4" w:space="0"/>
         </w:tcBorders>
       </w:tcPr>
@@ -26928,10 +26921,10 @@
       <w:tcPr>
         <w:shd w:val="clear" w:color="ffffff" w:themeColor="light1" w:fill="ffffff" w:themeFill="light1"/>
         <w:tcBorders>
-          <w:top w:val="none"/>
-          <w:left w:val="none"/>
+          <w:top w:val="none" w:color="000000" w:sz="4" w:space="0"/>
+          <w:left w:val="none" w:color="000000" w:sz="4" w:space="0"/>
           <w:bottom w:val="single" w:color="000000" w:themeColor="accent5" w:themeTint="90" w:sz="4" w:space="0"/>
-          <w:right w:val="none"/>
+          <w:right w:val="none" w:color="000000" w:sz="4" w:space="0"/>
         </w:tcBorders>
       </w:tcPr>
     </w:tblStylePr>
@@ -26951,12 +26944,12 @@
         <w:tblBorders/>
       </w:tblPr>
       <w:tcPr>
-        <w:shd w:color="ffffff"/>
+        <w:shd w:val="clear" w:color="ffffff"/>
         <w:tcBorders>
-          <w:top w:val="none"/>
+          <w:top w:val="none" w:color="000000" w:sz="4" w:space="0"/>
           <w:left w:val="single" w:color="000000" w:themeColor="accent5" w:themeTint="90" w:sz="4" w:space="0"/>
-          <w:bottom w:val="none"/>
-          <w:right w:val="none"/>
+          <w:bottom w:val="none" w:color="000000" w:sz="4" w:space="0"/>
+          <w:right w:val="none" w:color="000000" w:sz="4" w:space="0"/>
         </w:tcBorders>
       </w:tcPr>
     </w:tblStylePr>
@@ -26979,9 +26972,9 @@
         <w:shd w:val="clear" w:color="ffffff" w:themeColor="light1" w:fill="ffffff" w:themeFill="light1"/>
         <w:tcBorders>
           <w:top w:val="single" w:color="000000" w:themeColor="accent5" w:themeTint="90" w:sz="4" w:space="0"/>
-          <w:left w:val="none"/>
-          <w:bottom w:val="none"/>
-          <w:right w:val="none"/>
+          <w:left w:val="none" w:color="000000" w:sz="4" w:space="0"/>
+          <w:bottom w:val="none" w:color="000000" w:sz="4" w:space="0"/>
+          <w:right w:val="none" w:color="000000" w:sz="4" w:space="0"/>
         </w:tcBorders>
       </w:tcPr>
     </w:tblStylePr>
@@ -27051,9 +27044,9 @@
       </w:tcPr>
     </w:tblStylePr>
   </w:style>
-  <w:style w:type="table" w:styleId="67">
+  <w:style w:type="table" w:styleId="787">
     <w:name w:val="Grid Table 7 Colorful - Accent 6"/>
-    <w:basedOn w:val="11"/>
+    <w:basedOn w:val="731"/>
     <w:uiPriority w:val="99"/>
     <w:pPr>
       <w:pBdr/>
@@ -27155,11 +27148,11 @@
         <w:tblBorders/>
       </w:tblPr>
       <w:tcPr>
-        <w:shd w:color="ffffff"/>
+        <w:shd w:val="clear" w:color="ffffff"/>
         <w:tcBorders>
-          <w:top w:val="none"/>
-          <w:left w:val="none"/>
-          <w:bottom w:val="none"/>
+          <w:top w:val="none" w:color="000000" w:sz="4" w:space="0"/>
+          <w:left w:val="none" w:color="000000" w:sz="4" w:space="0"/>
+          <w:bottom w:val="none" w:color="000000" w:sz="4" w:space="0"/>
           <w:right w:val="single" w:color="000000" w:themeColor="accent6" w:themeTint="90" w:sz="4" w:space="0"/>
         </w:tcBorders>
       </w:tcPr>
@@ -27182,10 +27175,10 @@
       <w:tcPr>
         <w:shd w:val="clear" w:color="ffffff" w:themeColor="light1" w:fill="ffffff" w:themeFill="light1"/>
         <w:tcBorders>
-          <w:top w:val="none"/>
-          <w:left w:val="none"/>
+          <w:top w:val="none" w:color="000000" w:sz="4" w:space="0"/>
+          <w:left w:val="none" w:color="000000" w:sz="4" w:space="0"/>
           <w:bottom w:val="single" w:color="000000" w:themeColor="accent6" w:themeTint="90" w:sz="4" w:space="0"/>
-          <w:right w:val="none"/>
+          <w:right w:val="none" w:color="000000" w:sz="4" w:space="0"/>
         </w:tcBorders>
       </w:tcPr>
     </w:tblStylePr>
@@ -27205,12 +27198,12 @@
         <w:tblBorders/>
       </w:tblPr>
       <w:tcPr>
-        <w:shd w:color="ffffff"/>
+        <w:shd w:val="clear" w:color="ffffff"/>
         <w:tcBorders>
-          <w:top w:val="none"/>
+          <w:top w:val="none" w:color="000000" w:sz="4" w:space="0"/>
           <w:left w:val="single" w:color="000000" w:themeColor="accent6" w:themeTint="90" w:sz="4" w:space="0"/>
-          <w:bottom w:val="none"/>
-          <w:right w:val="none"/>
+          <w:bottom w:val="none" w:color="000000" w:sz="4" w:space="0"/>
+          <w:right w:val="none" w:color="000000" w:sz="4" w:space="0"/>
         </w:tcBorders>
       </w:tcPr>
     </w:tblStylePr>
@@ -27233,9 +27226,9 @@
         <w:shd w:val="clear" w:color="ffffff" w:themeColor="light1" w:fill="ffffff" w:themeFill="light1"/>
         <w:tcBorders>
           <w:top w:val="single" w:color="000000" w:themeColor="accent6" w:themeTint="90" w:sz="4" w:space="0"/>
-          <w:left w:val="none"/>
-          <w:bottom w:val="none"/>
-          <w:right w:val="none"/>
+          <w:left w:val="none" w:color="000000" w:sz="4" w:space="0"/>
+          <w:bottom w:val="none" w:color="000000" w:sz="4" w:space="0"/>
+          <w:right w:val="none" w:color="000000" w:sz="4" w:space="0"/>
         </w:tcBorders>
       </w:tcPr>
     </w:tblStylePr>
@@ -27305,9 +27298,9 @@
       </w:tcPr>
     </w:tblStylePr>
   </w:style>
-  <w:style w:type="table" w:styleId="68">
+  <w:style w:type="table" w:styleId="788">
     <w:name w:val="List Table 1 Light"/>
-    <w:basedOn w:val="11"/>
+    <w:basedOn w:val="731"/>
     <w:uiPriority w:val="99"/>
     <w:pPr>
       <w:pBdr/>
@@ -27521,9 +27514,9 @@
       </w:tcPr>
     </w:tblStylePr>
   </w:style>
-  <w:style w:type="table" w:styleId="69">
+  <w:style w:type="table" w:styleId="789">
     <w:name w:val="List Table 1 Light - Accent 1"/>
-    <w:basedOn w:val="11"/>
+    <w:basedOn w:val="731"/>
     <w:uiPriority w:val="99"/>
     <w:pPr>
       <w:pBdr/>
@@ -27737,9 +27730,9 @@
       </w:tcPr>
     </w:tblStylePr>
   </w:style>
-  <w:style w:type="table" w:styleId="70">
+  <w:style w:type="table" w:styleId="790">
     <w:name w:val="List Table 1 Light - Accent 2"/>
-    <w:basedOn w:val="11"/>
+    <w:basedOn w:val="731"/>
     <w:uiPriority w:val="99"/>
     <w:pPr>
       <w:pBdr/>
@@ -27953,9 +27946,9 @@
       </w:tcPr>
     </w:tblStylePr>
   </w:style>
-  <w:style w:type="table" w:styleId="71">
+  <w:style w:type="table" w:styleId="791">
     <w:name w:val="List Table 1 Light - Accent 3"/>
-    <w:basedOn w:val="11"/>
+    <w:basedOn w:val="731"/>
     <w:uiPriority w:val="99"/>
     <w:pPr>
       <w:pBdr/>
@@ -28169,9 +28162,9 @@
       </w:tcPr>
     </w:tblStylePr>
   </w:style>
-  <w:style w:type="table" w:styleId="72">
+  <w:style w:type="table" w:styleId="792">
     <w:name w:val="List Table 1 Light - Accent 4"/>
-    <w:basedOn w:val="11"/>
+    <w:basedOn w:val="731"/>
     <w:uiPriority w:val="99"/>
     <w:pPr>
       <w:pBdr/>
@@ -28385,9 +28378,9 @@
       </w:tcPr>
     </w:tblStylePr>
   </w:style>
-  <w:style w:type="table" w:styleId="73">
+  <w:style w:type="table" w:styleId="793">
     <w:name w:val="List Table 1 Light - Accent 5"/>
-    <w:basedOn w:val="11"/>
+    <w:basedOn w:val="731"/>
     <w:uiPriority w:val="99"/>
     <w:pPr>
       <w:pBdr/>
@@ -28601,9 +28594,9 @@
       </w:tcPr>
     </w:tblStylePr>
   </w:style>
-  <w:style w:type="table" w:styleId="74">
+  <w:style w:type="table" w:styleId="794">
     <w:name w:val="List Table 1 Light - Accent 6"/>
-    <w:basedOn w:val="11"/>
+    <w:basedOn w:val="731"/>
     <w:uiPriority w:val="99"/>
     <w:pPr>
       <w:pBdr/>
@@ -28817,9 +28810,9 @@
       </w:tcPr>
     </w:tblStylePr>
   </w:style>
-  <w:style w:type="table" w:styleId="75">
+  <w:style w:type="table" w:styleId="795">
     <w:name w:val="List Table 2"/>
-    <w:basedOn w:val="11"/>
+    <w:basedOn w:val="731"/>
     <w:uiPriority w:val="99"/>
     <w:pPr>
       <w:pBdr/>
@@ -29055,9 +29048,9 @@
       </w:tcPr>
     </w:tblStylePr>
   </w:style>
-  <w:style w:type="table" w:styleId="76">
+  <w:style w:type="table" w:styleId="796">
     <w:name w:val="List Table 2 - Accent 1"/>
-    <w:basedOn w:val="11"/>
+    <w:basedOn w:val="731"/>
     <w:uiPriority w:val="99"/>
     <w:pPr>
       <w:pBdr/>
@@ -29293,9 +29286,9 @@
       </w:tcPr>
     </w:tblStylePr>
   </w:style>
-  <w:style w:type="table" w:styleId="77">
+  <w:style w:type="table" w:styleId="797">
     <w:name w:val="List Table 2 - Accent 2"/>
-    <w:basedOn w:val="11"/>
+    <w:basedOn w:val="731"/>
     <w:uiPriority w:val="99"/>
     <w:pPr>
       <w:pBdr/>
@@ -29531,9 +29524,9 @@
       </w:tcPr>
     </w:tblStylePr>
   </w:style>
-  <w:style w:type="table" w:styleId="78">
+  <w:style w:type="table" w:styleId="798">
     <w:name w:val="List Table 2 - Accent 3"/>
-    <w:basedOn w:val="11"/>
+    <w:basedOn w:val="731"/>
     <w:uiPriority w:val="99"/>
     <w:pPr>
       <w:pBdr/>
@@ -29769,9 +29762,9 @@
       </w:tcPr>
     </w:tblStylePr>
   </w:style>
-  <w:style w:type="table" w:styleId="79">
+  <w:style w:type="table" w:styleId="799">
     <w:name w:val="List Table 2 - Accent 4"/>
-    <w:basedOn w:val="11"/>
+    <w:basedOn w:val="731"/>
     <w:uiPriority w:val="99"/>
     <w:pPr>
       <w:pBdr/>
@@ -30007,9 +30000,9 @@
       </w:tcPr>
     </w:tblStylePr>
   </w:style>
-  <w:style w:type="table" w:styleId="80">
+  <w:style w:type="table" w:styleId="800">
     <w:name w:val="List Table 2 - Accent 5"/>
-    <w:basedOn w:val="11"/>
+    <w:basedOn w:val="731"/>
     <w:uiPriority w:val="99"/>
     <w:pPr>
       <w:pBdr/>
@@ -30245,9 +30238,9 @@
       </w:tcPr>
     </w:tblStylePr>
   </w:style>
-  <w:style w:type="table" w:styleId="81">
+  <w:style w:type="table" w:styleId="801">
     <w:name w:val="List Table 2 - Accent 6"/>
-    <w:basedOn w:val="11"/>
+    <w:basedOn w:val="731"/>
     <w:uiPriority w:val="99"/>
     <w:pPr>
       <w:pBdr/>
@@ -30483,9 +30476,9 @@
       </w:tcPr>
     </w:tblStylePr>
   </w:style>
-  <w:style w:type="table" w:styleId="82">
+  <w:style w:type="table" w:styleId="802">
     <w:name w:val="List Table 3"/>
-    <w:basedOn w:val="11"/>
+    <w:basedOn w:val="731"/>
     <w:uiPriority w:val="99"/>
     <w:pPr>
       <w:pBdr/>
@@ -30711,9 +30704,9 @@
       </w:tcPr>
     </w:tblStylePr>
   </w:style>
-  <w:style w:type="table" w:styleId="83">
+  <w:style w:type="table" w:styleId="803">
     <w:name w:val="List Table 3 - Accent 1"/>
-    <w:basedOn w:val="11"/>
+    <w:basedOn w:val="731"/>
     <w:uiPriority w:val="99"/>
     <w:pPr>
       <w:pBdr/>
@@ -30939,9 +30932,9 @@
       </w:tcPr>
     </w:tblStylePr>
   </w:style>
-  <w:style w:type="table" w:styleId="84">
+  <w:style w:type="table" w:styleId="804">
     <w:name w:val="List Table 3 - Accent 2"/>
-    <w:basedOn w:val="11"/>
+    <w:basedOn w:val="731"/>
     <w:uiPriority w:val="99"/>
     <w:pPr>
       <w:pBdr/>
@@ -31167,9 +31160,9 @@
       </w:tcPr>
     </w:tblStylePr>
   </w:style>
-  <w:style w:type="table" w:styleId="85">
+  <w:style w:type="table" w:styleId="805">
     <w:name w:val="List Table 3 - Accent 3"/>
-    <w:basedOn w:val="11"/>
+    <w:basedOn w:val="731"/>
     <w:uiPriority w:val="99"/>
     <w:pPr>
       <w:pBdr/>
@@ -31395,9 +31388,9 @@
       </w:tcPr>
     </w:tblStylePr>
   </w:style>
-  <w:style w:type="table" w:styleId="86">
+  <w:style w:type="table" w:styleId="806">
     <w:name w:val="List Table 3 - Accent 4"/>
-    <w:basedOn w:val="11"/>
+    <w:basedOn w:val="731"/>
     <w:uiPriority w:val="99"/>
     <w:pPr>
       <w:pBdr/>
@@ -31623,9 +31616,9 @@
       </w:tcPr>
     </w:tblStylePr>
   </w:style>
-  <w:style w:type="table" w:styleId="87">
+  <w:style w:type="table" w:styleId="807">
     <w:name w:val="List Table 3 - Accent 5"/>
-    <w:basedOn w:val="11"/>
+    <w:basedOn w:val="731"/>
     <w:uiPriority w:val="99"/>
     <w:pPr>
       <w:pBdr/>
@@ -31851,9 +31844,9 @@
       </w:tcPr>
     </w:tblStylePr>
   </w:style>
-  <w:style w:type="table" w:styleId="88">
+  <w:style w:type="table" w:styleId="808">
     <w:name w:val="List Table 3 - Accent 6"/>
-    <w:basedOn w:val="11"/>
+    <w:basedOn w:val="731"/>
     <w:uiPriority w:val="99"/>
     <w:pPr>
       <w:pBdr/>
@@ -32079,9 +32072,9 @@
       </w:tcPr>
     </w:tblStylePr>
   </w:style>
-  <w:style w:type="table" w:styleId="89">
+  <w:style w:type="table" w:styleId="809">
     <w:name w:val="List Table 4"/>
-    <w:basedOn w:val="11"/>
+    <w:basedOn w:val="731"/>
     <w:uiPriority w:val="99"/>
     <w:pPr>
       <w:pBdr/>
@@ -32304,9 +32297,9 @@
       </w:tcPr>
     </w:tblStylePr>
   </w:style>
-  <w:style w:type="table" w:styleId="90">
+  <w:style w:type="table" w:styleId="810">
     <w:name w:val="List Table 4 - Accent 1"/>
-    <w:basedOn w:val="11"/>
+    <w:basedOn w:val="731"/>
     <w:uiPriority w:val="99"/>
     <w:pPr>
       <w:pBdr/>
@@ -32529,9 +32522,9 @@
       </w:tcPr>
     </w:tblStylePr>
   </w:style>
-  <w:style w:type="table" w:styleId="91">
+  <w:style w:type="table" w:styleId="811">
     <w:name w:val="List Table 4 - Accent 2"/>
-    <w:basedOn w:val="11"/>
+    <w:basedOn w:val="731"/>
     <w:uiPriority w:val="99"/>
     <w:pPr>
       <w:pBdr/>
@@ -32754,9 +32747,9 @@
       </w:tcPr>
     </w:tblStylePr>
   </w:style>
-  <w:style w:type="table" w:styleId="92">
+  <w:style w:type="table" w:styleId="812">
     <w:name w:val="List Table 4 - Accent 3"/>
-    <w:basedOn w:val="11"/>
+    <w:basedOn w:val="731"/>
     <w:uiPriority w:val="99"/>
     <w:pPr>
       <w:pBdr/>
@@ -32979,9 +32972,9 @@
       </w:tcPr>
     </w:tblStylePr>
   </w:style>
-  <w:style w:type="table" w:styleId="93">
+  <w:style w:type="table" w:styleId="813">
     <w:name w:val="List Table 4 - Accent 4"/>
-    <w:basedOn w:val="11"/>
+    <w:basedOn w:val="731"/>
     <w:uiPriority w:val="99"/>
     <w:pPr>
       <w:pBdr/>
@@ -33204,9 +33197,9 @@
       </w:tcPr>
     </w:tblStylePr>
   </w:style>
-  <w:style w:type="table" w:styleId="94">
+  <w:style w:type="table" w:styleId="814">
     <w:name w:val="List Table 4 - Accent 5"/>
-    <w:basedOn w:val="11"/>
+    <w:basedOn w:val="731"/>
     <w:uiPriority w:val="99"/>
     <w:pPr>
       <w:pBdr/>
@@ -33429,9 +33422,9 @@
       </w:tcPr>
     </w:tblStylePr>
   </w:style>
-  <w:style w:type="table" w:styleId="95">
+  <w:style w:type="table" w:styleId="815">
     <w:name w:val="List Table 4 - Accent 6"/>
-    <w:basedOn w:val="11"/>
+    <w:basedOn w:val="731"/>
     <w:uiPriority w:val="99"/>
     <w:pPr>
       <w:pBdr/>
@@ -33654,9 +33647,9 @@
       </w:tcPr>
     </w:tblStylePr>
   </w:style>
-  <w:style w:type="table" w:styleId="96">
+  <w:style w:type="table" w:styleId="816">
     <w:name w:val="List Table 5 Dark"/>
-    <w:basedOn w:val="11"/>
+    <w:basedOn w:val="731"/>
     <w:uiPriority w:val="99"/>
     <w:pPr>
       <w:pBdr/>
@@ -33896,9 +33889,9 @@
       </w:tcPr>
     </w:tblStylePr>
   </w:style>
-  <w:style w:type="table" w:styleId="97">
+  <w:style w:type="table" w:styleId="817">
     <w:name w:val="List Table 5 Dark - Accent 1"/>
-    <w:basedOn w:val="11"/>
+    <w:basedOn w:val="731"/>
     <w:uiPriority w:val="99"/>
     <w:pPr>
       <w:pBdr/>
@@ -34138,9 +34131,9 @@
       </w:tcPr>
     </w:tblStylePr>
   </w:style>
-  <w:style w:type="table" w:styleId="98">
+  <w:style w:type="table" w:styleId="818">
     <w:name w:val="List Table 5 Dark - Accent 2"/>
-    <w:basedOn w:val="11"/>
+    <w:basedOn w:val="731"/>
     <w:uiPriority w:val="99"/>
     <w:pPr>
       <w:pBdr/>
@@ -34380,9 +34373,9 @@
       </w:tcPr>
     </w:tblStylePr>
   </w:style>
-  <w:style w:type="table" w:styleId="99">
+  <w:style w:type="table" w:styleId="819">
     <w:name w:val="List Table 5 Dark - Accent 3"/>
-    <w:basedOn w:val="11"/>
+    <w:basedOn w:val="731"/>
     <w:uiPriority w:val="99"/>
     <w:pPr>
       <w:pBdr/>
@@ -34622,9 +34615,9 @@
       </w:tcPr>
     </w:tblStylePr>
   </w:style>
-  <w:style w:type="table" w:styleId="100">
+  <w:style w:type="table" w:styleId="820">
     <w:name w:val="List Table 5 Dark - Accent 4"/>
-    <w:basedOn w:val="11"/>
+    <w:basedOn w:val="731"/>
     <w:uiPriority w:val="99"/>
     <w:pPr>
       <w:pBdr/>
@@ -34864,9 +34857,9 @@
       </w:tcPr>
     </w:tblStylePr>
   </w:style>
-  <w:style w:type="table" w:styleId="101">
+  <w:style w:type="table" w:styleId="821">
     <w:name w:val="List Table 5 Dark - Accent 5"/>
-    <w:basedOn w:val="11"/>
+    <w:basedOn w:val="731"/>
     <w:uiPriority w:val="99"/>
     <w:pPr>
       <w:pBdr/>
@@ -35106,9 +35099,9 @@
       </w:tcPr>
     </w:tblStylePr>
   </w:style>
-  <w:style w:type="table" w:styleId="102">
+  <w:style w:type="table" w:styleId="822">
     <w:name w:val="List Table 5 Dark - Accent 6"/>
-    <w:basedOn w:val="11"/>
+    <w:basedOn w:val="731"/>
     <w:uiPriority w:val="99"/>
     <w:pPr>
       <w:pBdr/>
@@ -35348,9 +35341,9 @@
       </w:tcPr>
     </w:tblStylePr>
   </w:style>
-  <w:style w:type="table" w:styleId="103">
+  <w:style w:type="table" w:styleId="823">
     <w:name w:val="List Table 6 Colorful"/>
-    <w:basedOn w:val="11"/>
+    <w:basedOn w:val="731"/>
     <w:uiPriority w:val="99"/>
     <w:pPr>
       <w:pBdr/>
@@ -35571,9 +35564,9 @@
       </w:tcPr>
     </w:tblStylePr>
   </w:style>
-  <w:style w:type="table" w:styleId="104">
+  <w:style w:type="table" w:styleId="824">
     <w:name w:val="List Table 6 Colorful - Accent 1"/>
-    <w:basedOn w:val="11"/>
+    <w:basedOn w:val="731"/>
     <w:uiPriority w:val="99"/>
     <w:pPr>
       <w:pBdr/>
@@ -35794,9 +35787,9 @@
       </w:tcPr>
     </w:tblStylePr>
   </w:style>
-  <w:style w:type="table" w:styleId="105">
+  <w:style w:type="table" w:styleId="825">
     <w:name w:val="List Table 6 Colorful - Accent 2"/>
-    <w:basedOn w:val="11"/>
+    <w:basedOn w:val="731"/>
     <w:uiPriority w:val="99"/>
     <w:pPr>
       <w:pBdr/>
@@ -36017,9 +36010,9 @@
       </w:tcPr>
     </w:tblStylePr>
   </w:style>
-  <w:style w:type="table" w:styleId="106">
+  <w:style w:type="table" w:styleId="826">
     <w:name w:val="List Table 6 Colorful - Accent 3"/>
-    <w:basedOn w:val="11"/>
+    <w:basedOn w:val="731"/>
     <w:uiPriority w:val="99"/>
     <w:pPr>
       <w:pBdr/>
@@ -36240,9 +36233,9 @@
       </w:tcPr>
     </w:tblStylePr>
   </w:style>
-  <w:style w:type="table" w:styleId="107">
+  <w:style w:type="table" w:styleId="827">
     <w:name w:val="List Table 6 Colorful - Accent 4"/>
-    <w:basedOn w:val="11"/>
+    <w:basedOn w:val="731"/>
     <w:uiPriority w:val="99"/>
     <w:pPr>
       <w:pBdr/>
@@ -36463,9 +36456,9 @@
       </w:tcPr>
     </w:tblStylePr>
   </w:style>
-  <w:style w:type="table" w:styleId="108">
+  <w:style w:type="table" w:styleId="828">
     <w:name w:val="List Table 6 Colorful - Accent 5"/>
-    <w:basedOn w:val="11"/>
+    <w:basedOn w:val="731"/>
     <w:uiPriority w:val="99"/>
     <w:pPr>
       <w:pBdr/>
@@ -36686,9 +36679,9 @@
       </w:tcPr>
     </w:tblStylePr>
   </w:style>
-  <w:style w:type="table" w:styleId="109">
+  <w:style w:type="table" w:styleId="829">
     <w:name w:val="List Table 6 Colorful - Accent 6"/>
-    <w:basedOn w:val="11"/>
+    <w:basedOn w:val="731"/>
     <w:uiPriority w:val="99"/>
     <w:pPr>
       <w:pBdr/>
@@ -36909,9 +36902,9 @@
       </w:tcPr>
     </w:tblStylePr>
   </w:style>
-  <w:style w:type="table" w:styleId="110">
+  <w:style w:type="table" w:styleId="830">
     <w:name w:val="List Table 7 Colorful"/>
-    <w:basedOn w:val="11"/>
+    <w:basedOn w:val="731"/>
     <w:uiPriority w:val="99"/>
     <w:pPr>
       <w:pBdr/>
@@ -37010,11 +37003,11 @@
         <w:tblBorders/>
       </w:tblPr>
       <w:tcPr>
-        <w:shd w:color="ffffff"/>
+        <w:shd w:val="clear" w:color="ffffff"/>
         <w:tcBorders>
-          <w:top w:val="none"/>
-          <w:left w:val="none"/>
-          <w:bottom w:val="none"/>
+          <w:top w:val="none" w:color="000000" w:sz="4" w:space="0"/>
+          <w:left w:val="none" w:color="000000" w:sz="4" w:space="0"/>
+          <w:bottom w:val="none" w:color="000000" w:sz="4" w:space="0"/>
           <w:right w:val="single" w:color="000000" w:themeColor="text1" w:themeTint="80" w:sz="4" w:space="0"/>
         </w:tcBorders>
       </w:tcPr>
@@ -37037,10 +37030,10 @@
       <w:tcPr>
         <w:shd w:val="clear" w:color="ffffff" w:themeColor="light1" w:fill="ffffff" w:themeFill="light1"/>
         <w:tcBorders>
-          <w:top w:val="none"/>
-          <w:left w:val="none"/>
+          <w:top w:val="none" w:color="000000" w:sz="4" w:space="0"/>
+          <w:left w:val="none" w:color="000000" w:sz="4" w:space="0"/>
           <w:bottom w:val="single" w:color="000000" w:themeColor="text1" w:themeTint="80" w:sz="4" w:space="0"/>
-          <w:right w:val="none"/>
+          <w:right w:val="none" w:color="000000" w:sz="4" w:space="0"/>
         </w:tcBorders>
       </w:tcPr>
     </w:tblStylePr>
@@ -37060,12 +37053,12 @@
         <w:tblBorders/>
       </w:tblPr>
       <w:tcPr>
-        <w:shd w:color="ffffff"/>
+        <w:shd w:val="clear" w:color="ffffff"/>
         <w:tcBorders>
-          <w:top w:val="none"/>
+          <w:top w:val="none" w:color="000000" w:sz="4" w:space="0"/>
           <w:left w:val="single" w:color="000000" w:themeColor="text1" w:themeTint="80" w:sz="4" w:space="0"/>
-          <w:bottom w:val="none"/>
-          <w:right w:val="none"/>
+          <w:bottom w:val="none" w:color="000000" w:sz="4" w:space="0"/>
+          <w:right w:val="none" w:color="000000" w:sz="4" w:space="0"/>
         </w:tcBorders>
       </w:tcPr>
     </w:tblStylePr>
@@ -37088,9 +37081,9 @@
         <w:shd w:val="clear" w:color="ffffff" w:themeColor="light1" w:fill="ffffff" w:themeFill="light1"/>
         <w:tcBorders>
           <w:top w:val="single" w:color="000000" w:themeColor="text1" w:themeTint="80" w:sz="4" w:space="0"/>
-          <w:left w:val="none"/>
-          <w:bottom w:val="none"/>
-          <w:right w:val="none"/>
+          <w:left w:val="none" w:color="000000" w:sz="4" w:space="0"/>
+          <w:bottom w:val="none" w:color="000000" w:sz="4" w:space="0"/>
+          <w:right w:val="none" w:color="000000" w:sz="4" w:space="0"/>
         </w:tcBorders>
       </w:tcPr>
     </w:tblStylePr>
@@ -37165,9 +37158,9 @@
       </w:tcPr>
     </w:tblStylePr>
   </w:style>
-  <w:style w:type="table" w:styleId="111">
+  <w:style w:type="table" w:styleId="831">
     <w:name w:val="List Table 7 Colorful - Accent 1"/>
-    <w:basedOn w:val="11"/>
+    <w:basedOn w:val="731"/>
     <w:uiPriority w:val="99"/>
     <w:pPr>
       <w:pBdr/>
@@ -37266,11 +37259,11 @@
         <w:tblBorders/>
       </w:tblPr>
       <w:tcPr>
-        <w:shd w:color="ffffff"/>
+        <w:shd w:val="clear" w:color="ffffff"/>
         <w:tcBorders>
-          <w:top w:val="none"/>
-          <w:left w:val="none"/>
-          <w:bottom w:val="none"/>
+          <w:top w:val="none" w:color="000000" w:sz="4" w:space="0"/>
+          <w:left w:val="none" w:color="000000" w:sz="4" w:space="0"/>
+          <w:bottom w:val="none" w:color="000000" w:sz="4" w:space="0"/>
           <w:right w:val="single" w:color="000000" w:themeColor="accent1" w:sz="4" w:space="0"/>
         </w:tcBorders>
       </w:tcPr>
@@ -37293,10 +37286,10 @@
       <w:tcPr>
         <w:shd w:val="clear" w:color="ffffff" w:themeColor="light1" w:fill="ffffff" w:themeFill="light1"/>
         <w:tcBorders>
-          <w:top w:val="none"/>
-          <w:left w:val="none"/>
+          <w:top w:val="none" w:color="000000" w:sz="4" w:space="0"/>
+          <w:left w:val="none" w:color="000000" w:sz="4" w:space="0"/>
           <w:bottom w:val="single" w:color="000000" w:themeColor="accent1" w:sz="4" w:space="0"/>
-          <w:right w:val="none"/>
+          <w:right w:val="none" w:color="000000" w:sz="4" w:space="0"/>
         </w:tcBorders>
       </w:tcPr>
     </w:tblStylePr>
@@ -37316,12 +37309,12 @@
         <w:tblBorders/>
       </w:tblPr>
       <w:tcPr>
-        <w:shd w:color="ffffff"/>
+        <w:shd w:val="clear" w:color="ffffff"/>
         <w:tcBorders>
-          <w:top w:val="none"/>
+          <w:top w:val="none" w:color="000000" w:sz="4" w:space="0"/>
           <w:left w:val="single" w:color="000000" w:themeColor="accent1" w:sz="4" w:space="0"/>
-          <w:bottom w:val="none"/>
-          <w:right w:val="none"/>
+          <w:bottom w:val="none" w:color="000000" w:sz="4" w:space="0"/>
+          <w:right w:val="none" w:color="000000" w:sz="4" w:space="0"/>
         </w:tcBorders>
       </w:tcPr>
     </w:tblStylePr>
@@ -37344,9 +37337,9 @@
         <w:shd w:val="clear" w:color="ffffff" w:themeColor="light1" w:fill="ffffff" w:themeFill="light1"/>
         <w:tcBorders>
           <w:top w:val="single" w:color="000000" w:themeColor="accent1" w:sz="4" w:space="0"/>
-          <w:left w:val="none"/>
-          <w:bottom w:val="none"/>
-          <w:right w:val="none"/>
+          <w:left w:val="none" w:color="000000" w:sz="4" w:space="0"/>
+          <w:bottom w:val="none" w:color="000000" w:sz="4" w:space="0"/>
+          <w:right w:val="none" w:color="000000" w:sz="4" w:space="0"/>
         </w:tcBorders>
       </w:tcPr>
     </w:tblStylePr>
@@ -37421,9 +37414,9 @@
       </w:tcPr>
     </w:tblStylePr>
   </w:style>
-  <w:style w:type="table" w:styleId="112">
+  <w:style w:type="table" w:styleId="832">
     <w:name w:val="List Table 7 Colorful - Accent 2"/>
-    <w:basedOn w:val="11"/>
+    <w:basedOn w:val="731"/>
     <w:uiPriority w:val="99"/>
     <w:pPr>
       <w:pBdr/>
@@ -37522,11 +37515,11 @@
         <w:tblBorders/>
       </w:tblPr>
       <w:tcPr>
-        <w:shd w:color="ffffff"/>
+        <w:shd w:val="clear" w:color="ffffff"/>
         <w:tcBorders>
-          <w:top w:val="none"/>
-          <w:left w:val="none"/>
-          <w:bottom w:val="none"/>
+          <w:top w:val="none" w:color="000000" w:sz="4" w:space="0"/>
+          <w:left w:val="none" w:color="000000" w:sz="4" w:space="0"/>
+          <w:bottom w:val="none" w:color="000000" w:sz="4" w:space="0"/>
           <w:right w:val="single" w:color="000000" w:themeColor="accent2" w:themeTint="97" w:sz="4" w:space="0"/>
         </w:tcBorders>
       </w:tcPr>
@@ -37549,10 +37542,10 @@
       <w:tcPr>
         <w:shd w:val="clear" w:color="ffffff" w:themeColor="light1" w:fill="ffffff" w:themeFill="light1"/>
         <w:tcBorders>
-          <w:top w:val="none"/>
-          <w:left w:val="none"/>
+          <w:top w:val="none" w:color="000000" w:sz="4" w:space="0"/>
+          <w:left w:val="none" w:color="000000" w:sz="4" w:space="0"/>
           <w:bottom w:val="single" w:color="000000" w:themeColor="accent2" w:themeTint="97" w:sz="4" w:space="0"/>
-          <w:right w:val="none"/>
+          <w:right w:val="none" w:color="000000" w:sz="4" w:space="0"/>
         </w:tcBorders>
       </w:tcPr>
     </w:tblStylePr>
@@ -37572,12 +37565,12 @@
         <w:tblBorders/>
       </w:tblPr>
       <w:tcPr>
-        <w:shd w:color="ffffff"/>
+        <w:shd w:val="clear" w:color="ffffff"/>
         <w:tcBorders>
-          <w:top w:val="none"/>
+          <w:top w:val="none" w:color="000000" w:sz="4" w:space="0"/>
           <w:left w:val="single" w:color="000000" w:themeColor="accent2" w:themeTint="97" w:sz="4" w:space="0"/>
-          <w:bottom w:val="none"/>
-          <w:right w:val="none"/>
+          <w:bottom w:val="none" w:color="000000" w:sz="4" w:space="0"/>
+          <w:right w:val="none" w:color="000000" w:sz="4" w:space="0"/>
         </w:tcBorders>
       </w:tcPr>
     </w:tblStylePr>
@@ -37600,9 +37593,9 @@
         <w:shd w:val="clear" w:color="ffffff" w:themeColor="light1" w:fill="ffffff" w:themeFill="light1"/>
         <w:tcBorders>
           <w:top w:val="single" w:color="000000" w:themeColor="accent2" w:themeTint="97" w:sz="4" w:space="0"/>
-          <w:left w:val="none"/>
-          <w:bottom w:val="none"/>
-          <w:right w:val="none"/>
+          <w:left w:val="none" w:color="000000" w:sz="4" w:space="0"/>
+          <w:bottom w:val="none" w:color="000000" w:sz="4" w:space="0"/>
+          <w:right w:val="none" w:color="000000" w:sz="4" w:space="0"/>
         </w:tcBorders>
       </w:tcPr>
     </w:tblStylePr>
@@ -37677,9 +37670,9 @@
       </w:tcPr>
     </w:tblStylePr>
   </w:style>
-  <w:style w:type="table" w:styleId="113">
+  <w:style w:type="table" w:styleId="833">
     <w:name w:val="List Table 7 Colorful - Accent 3"/>
-    <w:basedOn w:val="11"/>
+    <w:basedOn w:val="731"/>
     <w:uiPriority w:val="99"/>
     <w:pPr>
       <w:pBdr/>
@@ -37778,11 +37771,11 @@
         <w:tblBorders/>
       </w:tblPr>
       <w:tcPr>
-        <w:shd w:color="ffffff"/>
+        <w:shd w:val="clear" w:color="ffffff"/>
         <w:tcBorders>
-          <w:top w:val="none"/>
-          <w:left w:val="none"/>
-          <w:bottom w:val="none"/>
+          <w:top w:val="none" w:color="000000" w:sz="4" w:space="0"/>
+          <w:left w:val="none" w:color="000000" w:sz="4" w:space="0"/>
+          <w:bottom w:val="none" w:color="000000" w:sz="4" w:space="0"/>
           <w:right w:val="single" w:color="000000" w:themeColor="accent3" w:themeTint="98" w:sz="4" w:space="0"/>
         </w:tcBorders>
       </w:tcPr>
@@ -37805,10 +37798,10 @@
       <w:tcPr>
         <w:shd w:val="clear" w:color="ffffff" w:themeColor="light1" w:fill="ffffff" w:themeFill="light1"/>
         <w:tcBorders>
-          <w:top w:val="none"/>
-          <w:left w:val="none"/>
+          <w:top w:val="none" w:color="000000" w:sz="4" w:space="0"/>
+          <w:left w:val="none" w:color="000000" w:sz="4" w:space="0"/>
           <w:bottom w:val="single" w:color="000000" w:themeColor="accent3" w:themeTint="98" w:sz="4" w:space="0"/>
-          <w:right w:val="none"/>
+          <w:right w:val="none" w:color="000000" w:sz="4" w:space="0"/>
         </w:tcBorders>
       </w:tcPr>
     </w:tblStylePr>
@@ -37828,12 +37821,12 @@
         <w:tblBorders/>
       </w:tblPr>
       <w:tcPr>
-        <w:shd w:color="ffffff"/>
+        <w:shd w:val="clear" w:color="ffffff"/>
         <w:tcBorders>
-          <w:top w:val="none"/>
+          <w:top w:val="none" w:color="000000" w:sz="4" w:space="0"/>
           <w:left w:val="single" w:color="000000" w:themeColor="accent3" w:themeTint="98" w:sz="4" w:space="0"/>
-          <w:bottom w:val="none"/>
-          <w:right w:val="none"/>
+          <w:bottom w:val="none" w:color="000000" w:sz="4" w:space="0"/>
+          <w:right w:val="none" w:color="000000" w:sz="4" w:space="0"/>
         </w:tcBorders>
       </w:tcPr>
     </w:tblStylePr>
@@ -37856,9 +37849,9 @@
         <w:shd w:val="clear" w:color="ffffff" w:themeColor="light1" w:fill="ffffff" w:themeFill="light1"/>
         <w:tcBorders>
           <w:top w:val="single" w:color="000000" w:themeColor="accent3" w:themeTint="98" w:sz="4" w:space="0"/>
-          <w:left w:val="none"/>
-          <w:bottom w:val="none"/>
-          <w:right w:val="none"/>
+          <w:left w:val="none" w:color="000000" w:sz="4" w:space="0"/>
+          <w:bottom w:val="none" w:color="000000" w:sz="4" w:space="0"/>
+          <w:right w:val="none" w:color="000000" w:sz="4" w:space="0"/>
         </w:tcBorders>
       </w:tcPr>
     </w:tblStylePr>
@@ -37933,9 +37926,9 @@
       </w:tcPr>
     </w:tblStylePr>
   </w:style>
-  <w:style w:type="table" w:styleId="114">
+  <w:style w:type="table" w:styleId="834">
     <w:name w:val="List Table 7 Colorful - Accent 4"/>
-    <w:basedOn w:val="11"/>
+    <w:basedOn w:val="731"/>
     <w:uiPriority w:val="99"/>
     <w:pPr>
       <w:pBdr/>
@@ -38034,11 +38027,11 @@
         <w:tblBorders/>
       </w:tblPr>
       <w:tcPr>
-        <w:shd w:color="ffffff"/>
+        <w:shd w:val="clear" w:color="ffffff"/>
         <w:tcBorders>
-          <w:top w:val="none"/>
-          <w:left w:val="none"/>
-          <w:bottom w:val="none"/>
+          <w:top w:val="none" w:color="000000" w:sz="4" w:space="0"/>
+          <w:left w:val="none" w:color="000000" w:sz="4" w:space="0"/>
+          <w:bottom w:val="none" w:color="000000" w:sz="4" w:space="0"/>
           <w:right w:val="single" w:color="000000" w:themeColor="accent4" w:themeTint="9A" w:sz="4" w:space="0"/>
         </w:tcBorders>
       </w:tcPr>
@@ -38061,10 +38054,10 @@
       <w:tcPr>
         <w:shd w:val="clear" w:color="ffffff" w:themeColor="light1" w:fill="ffffff" w:themeFill="light1"/>
         <w:tcBorders>
-          <w:top w:val="none"/>
-          <w:left w:val="none"/>
+          <w:top w:val="none" w:color="000000" w:sz="4" w:space="0"/>
+          <w:left w:val="none" w:color="000000" w:sz="4" w:space="0"/>
           <w:bottom w:val="single" w:color="000000" w:themeColor="accent4" w:themeTint="9A" w:sz="4" w:space="0"/>
-          <w:right w:val="none"/>
+          <w:right w:val="none" w:color="000000" w:sz="4" w:space="0"/>
         </w:tcBorders>
       </w:tcPr>
     </w:tblStylePr>
@@ -38084,12 +38077,12 @@
         <w:tblBorders/>
       </w:tblPr>
       <w:tcPr>
-        <w:shd w:color="ffffff"/>
+        <w:shd w:val="clear" w:color="ffffff"/>
         <w:tcBorders>
-          <w:top w:val="none"/>
+          <w:top w:val="none" w:color="000000" w:sz="4" w:space="0"/>
           <w:left w:val="single" w:color="000000" w:themeColor="accent4" w:themeTint="9A" w:sz="4" w:space="0"/>
-          <w:bottom w:val="none"/>
-          <w:right w:val="none"/>
+          <w:bottom w:val="none" w:color="000000" w:sz="4" w:space="0"/>
+          <w:right w:val="none" w:color="000000" w:sz="4" w:space="0"/>
         </w:tcBorders>
       </w:tcPr>
     </w:tblStylePr>
@@ -38112,9 +38105,9 @@
         <w:shd w:val="clear" w:color="ffffff" w:themeColor="light1" w:fill="ffffff" w:themeFill="light1"/>
         <w:tcBorders>
           <w:top w:val="single" w:color="000000" w:themeColor="accent4" w:themeTint="9A" w:sz="4" w:space="0"/>
-          <w:left w:val="none"/>
-          <w:bottom w:val="none"/>
-          <w:right w:val="none"/>
+          <w:left w:val="none" w:color="000000" w:sz="4" w:space="0"/>
+          <w:bottom w:val="none" w:color="000000" w:sz="4" w:space="0"/>
+          <w:right w:val="none" w:color="000000" w:sz="4" w:space="0"/>
         </w:tcBorders>
       </w:tcPr>
     </w:tblStylePr>
@@ -38189,9 +38182,9 @@
       </w:tcPr>
     </w:tblStylePr>
   </w:style>
-  <w:style w:type="table" w:styleId="115">
+  <w:style w:type="table" w:styleId="835">
     <w:name w:val="List Table 7 Colorful - Accent 5"/>
-    <w:basedOn w:val="11"/>
+    <w:basedOn w:val="731"/>
     <w:uiPriority w:val="99"/>
     <w:pPr>
       <w:pBdr/>
@@ -38290,11 +38283,11 @@
         <w:tblBorders/>
       </w:tblPr>
       <w:tcPr>
-        <w:shd w:color="ffffff"/>
+        <w:shd w:val="clear" w:color="ffffff"/>
         <w:tcBorders>
-          <w:top w:val="none"/>
-          <w:left w:val="none"/>
-          <w:bottom w:val="none"/>
+          <w:top w:val="none" w:color="000000" w:sz="4" w:space="0"/>
+          <w:left w:val="none" w:color="000000" w:sz="4" w:space="0"/>
+          <w:bottom w:val="none" w:color="000000" w:sz="4" w:space="0"/>
           <w:right w:val="single" w:color="000000" w:themeColor="accent5" w:themeTint="9A" w:sz="4" w:space="0"/>
         </w:tcBorders>
       </w:tcPr>
@@ -38317,10 +38310,10 @@
       <w:tcPr>
         <w:shd w:val="clear" w:color="ffffff" w:themeColor="light1" w:fill="ffffff" w:themeFill="light1"/>
         <w:tcBorders>
-          <w:top w:val="none"/>
-          <w:left w:val="none"/>
+          <w:top w:val="none" w:color="000000" w:sz="4" w:space="0"/>
+          <w:left w:val="none" w:color="000000" w:sz="4" w:space="0"/>
           <w:bottom w:val="single" w:color="000000" w:themeColor="accent5" w:themeTint="9A" w:sz="4" w:space="0"/>
-          <w:right w:val="none"/>
+          <w:right w:val="none" w:color="000000" w:sz="4" w:space="0"/>
         </w:tcBorders>
       </w:tcPr>
     </w:tblStylePr>
@@ -38340,12 +38333,12 @@
         <w:tblBorders/>
       </w:tblPr>
       <w:tcPr>
-        <w:shd w:color="ffffff"/>
+        <w:shd w:val="clear" w:color="ffffff"/>
         <w:tcBorders>
-          <w:top w:val="none"/>
+          <w:top w:val="none" w:color="000000" w:sz="4" w:space="0"/>
           <w:left w:val="single" w:color="000000" w:themeColor="accent5" w:themeTint="9A" w:sz="4" w:space="0"/>
-          <w:bottom w:val="none"/>
-          <w:right w:val="none"/>
+          <w:bottom w:val="none" w:color="000000" w:sz="4" w:space="0"/>
+          <w:right w:val="none" w:color="000000" w:sz="4" w:space="0"/>
         </w:tcBorders>
       </w:tcPr>
     </w:tblStylePr>
@@ -38368,9 +38361,9 @@
         <w:shd w:val="clear" w:color="ffffff" w:themeColor="light1" w:fill="ffffff" w:themeFill="light1"/>
         <w:tcBorders>
           <w:top w:val="single" w:color="000000" w:themeColor="accent5" w:themeTint="9A" w:sz="4" w:space="0"/>
-          <w:left w:val="none"/>
-          <w:bottom w:val="none"/>
-          <w:right w:val="none"/>
+          <w:left w:val="none" w:color="000000" w:sz="4" w:space="0"/>
+          <w:bottom w:val="none" w:color="000000" w:sz="4" w:space="0"/>
+          <w:right w:val="none" w:color="000000" w:sz="4" w:space="0"/>
         </w:tcBorders>
       </w:tcPr>
     </w:tblStylePr>
@@ -38445,9 +38438,9 @@
       </w:tcPr>
     </w:tblStylePr>
   </w:style>
-  <w:style w:type="table" w:styleId="116">
+  <w:style w:type="table" w:styleId="836">
     <w:name w:val="List Table 7 Colorful - Accent 6"/>
-    <w:basedOn w:val="11"/>
+    <w:basedOn w:val="731"/>
     <w:uiPriority w:val="99"/>
     <w:pPr>
       <w:pBdr/>
@@ -38546,11 +38539,11 @@
         <w:tblBorders/>
       </w:tblPr>
       <w:tcPr>
-        <w:shd w:color="ffffff"/>
+        <w:shd w:val="clear" w:color="ffffff"/>
         <w:tcBorders>
-          <w:top w:val="none"/>
-          <w:left w:val="none"/>
-          <w:bottom w:val="none"/>
+          <w:top w:val="none" w:color="000000" w:sz="4" w:space="0"/>
+          <w:left w:val="none" w:color="000000" w:sz="4" w:space="0"/>
+          <w:bottom w:val="none" w:color="000000" w:sz="4" w:space="0"/>
           <w:right w:val="single" w:color="000000" w:themeColor="accent6" w:themeTint="98" w:sz="4" w:space="0"/>
         </w:tcBorders>
       </w:tcPr>
@@ -38573,10 +38566,10 @@
       <w:tcPr>
         <w:shd w:val="clear" w:color="ffffff" w:themeColor="light1" w:fill="ffffff" w:themeFill="light1"/>
         <w:tcBorders>
-          <w:top w:val="none"/>
-          <w:left w:val="none"/>
+          <w:top w:val="none" w:color="000000" w:sz="4" w:space="0"/>
+          <w:left w:val="none" w:color="000000" w:sz="4" w:space="0"/>
           <w:bottom w:val="single" w:color="000000" w:themeColor="accent6" w:themeTint="98" w:sz="4" w:space="0"/>
-          <w:right w:val="none"/>
+          <w:right w:val="none" w:color="000000" w:sz="4" w:space="0"/>
         </w:tcBorders>
       </w:tcPr>
     </w:tblStylePr>
@@ -38596,12 +38589,12 @@
         <w:tblBorders/>
       </w:tblPr>
       <w:tcPr>
-        <w:shd w:color="ffffff"/>
+        <w:shd w:val="clear" w:color="ffffff"/>
         <w:tcBorders>
-          <w:top w:val="none"/>
+          <w:top w:val="none" w:color="000000" w:sz="4" w:space="0"/>
           <w:left w:val="single" w:color="000000" w:themeColor="accent6" w:themeTint="98" w:sz="4" w:space="0"/>
-          <w:bottom w:val="none"/>
-          <w:right w:val="none"/>
+          <w:bottom w:val="none" w:color="000000" w:sz="4" w:space="0"/>
+          <w:right w:val="none" w:color="000000" w:sz="4" w:space="0"/>
         </w:tcBorders>
       </w:tcPr>
     </w:tblStylePr>
@@ -38624,9 +38617,9 @@
         <w:shd w:val="clear" w:color="ffffff" w:themeColor="light1" w:fill="ffffff" w:themeFill="light1"/>
         <w:tcBorders>
           <w:top w:val="single" w:color="000000" w:themeColor="accent6" w:themeTint="98" w:sz="4" w:space="0"/>
-          <w:left w:val="none"/>
-          <w:bottom w:val="none"/>
-          <w:right w:val="none"/>
+          <w:left w:val="none" w:color="000000" w:sz="4" w:space="0"/>
+          <w:bottom w:val="none" w:color="000000" w:sz="4" w:space="0"/>
+          <w:right w:val="none" w:color="000000" w:sz="4" w:space="0"/>
         </w:tcBorders>
       </w:tcPr>
     </w:tblStylePr>
@@ -38701,9 +38694,9 @@
       </w:tcPr>
     </w:tblStylePr>
   </w:style>
-  <w:style w:type="table" w:styleId="117">
+  <w:style w:type="table" w:styleId="837">
     <w:name w:val="Lined - Accent"/>
-    <w:basedOn w:val="11"/>
+    <w:basedOn w:val="731"/>
     <w:uiPriority w:val="99"/>
     <w:pPr>
       <w:pBdr/>
@@ -38938,9 +38931,9 @@
       </w:tcPr>
     </w:tblStylePr>
   </w:style>
-  <w:style w:type="table" w:styleId="118">
+  <w:style w:type="table" w:styleId="838">
     <w:name w:val="Lined - Accent 1"/>
-    <w:basedOn w:val="11"/>
+    <w:basedOn w:val="731"/>
     <w:uiPriority w:val="99"/>
     <w:pPr>
       <w:pBdr/>
@@ -39175,9 +39168,9 @@
       </w:tcPr>
     </w:tblStylePr>
   </w:style>
-  <w:style w:type="table" w:styleId="119">
+  <w:style w:type="table" w:styleId="839">
     <w:name w:val="Lined - Accent 2"/>
-    <w:basedOn w:val="11"/>
+    <w:basedOn w:val="731"/>
     <w:uiPriority w:val="99"/>
     <w:pPr>
       <w:pBdr/>
@@ -39412,9 +39405,9 @@
       </w:tcPr>
     </w:tblStylePr>
   </w:style>
-  <w:style w:type="table" w:styleId="120">
+  <w:style w:type="table" w:styleId="840">
     <w:name w:val="Lined - Accent 3"/>
-    <w:basedOn w:val="11"/>
+    <w:basedOn w:val="731"/>
     <w:uiPriority w:val="99"/>
     <w:pPr>
       <w:pBdr/>
@@ -39649,9 +39642,9 @@
       </w:tcPr>
     </w:tblStylePr>
   </w:style>
-  <w:style w:type="table" w:styleId="121">
+  <w:style w:type="table" w:styleId="841">
     <w:name w:val="Lined - Accent 4"/>
-    <w:basedOn w:val="11"/>
+    <w:basedOn w:val="731"/>
     <w:uiPriority w:val="99"/>
     <w:pPr>
       <w:pBdr/>
@@ -39886,9 +39879,9 @@
       </w:tcPr>
     </w:tblStylePr>
   </w:style>
-  <w:style w:type="table" w:styleId="122">
+  <w:style w:type="table" w:styleId="842">
     <w:name w:val="Lined - Accent 5"/>
-    <w:basedOn w:val="11"/>
+    <w:basedOn w:val="731"/>
     <w:uiPriority w:val="99"/>
     <w:pPr>
       <w:pBdr/>
@@ -40123,9 +40116,9 @@
       </w:tcPr>
     </w:tblStylePr>
   </w:style>
-  <w:style w:type="table" w:styleId="123">
+  <w:style w:type="table" w:styleId="843">
     <w:name w:val="Lined - Accent 6"/>
-    <w:basedOn w:val="11"/>
+    <w:basedOn w:val="731"/>
     <w:uiPriority w:val="99"/>
     <w:pPr>
       <w:pBdr/>
@@ -40360,9 +40353,9 @@
       </w:tcPr>
     </w:tblStylePr>
   </w:style>
-  <w:style w:type="table" w:styleId="124">
+  <w:style w:type="table" w:styleId="844">
     <w:name w:val="Bordered &amp; Lined - Accent"/>
-    <w:basedOn w:val="11"/>
+    <w:basedOn w:val="731"/>
     <w:uiPriority w:val="99"/>
     <w:pPr>
       <w:pBdr/>
@@ -40604,9 +40597,9 @@
       </w:tcPr>
     </w:tblStylePr>
   </w:style>
-  <w:style w:type="table" w:styleId="125">
+  <w:style w:type="table" w:styleId="845">
     <w:name w:val="Bordered &amp; Lined - Accent 1"/>
-    <w:basedOn w:val="11"/>
+    <w:basedOn w:val="731"/>
     <w:uiPriority w:val="99"/>
     <w:pPr>
       <w:pBdr/>
@@ -40848,9 +40841,9 @@
       </w:tcPr>
     </w:tblStylePr>
   </w:style>
-  <w:style w:type="table" w:styleId="126">
+  <w:style w:type="table" w:styleId="846">
     <w:name w:val="Bordered &amp; Lined - Accent 2"/>
-    <w:basedOn w:val="11"/>
+    <w:basedOn w:val="731"/>
     <w:uiPriority w:val="99"/>
     <w:pPr>
       <w:pBdr/>
@@ -41092,9 +41085,9 @@
       </w:tcPr>
     </w:tblStylePr>
   </w:style>
-  <w:style w:type="table" w:styleId="127">
+  <w:style w:type="table" w:styleId="847">
     <w:name w:val="Bordered &amp; Lined - Accent 3"/>
-    <w:basedOn w:val="11"/>
+    <w:basedOn w:val="731"/>
     <w:uiPriority w:val="99"/>
     <w:pPr>
       <w:pBdr/>
@@ -41336,9 +41329,9 @@
       </w:tcPr>
     </w:tblStylePr>
   </w:style>
-  <w:style w:type="table" w:styleId="128">
+  <w:style w:type="table" w:styleId="848">
     <w:name w:val="Bordered &amp; Lined - Accent 4"/>
-    <w:basedOn w:val="11"/>
+    <w:basedOn w:val="731"/>
     <w:uiPriority w:val="99"/>
     <w:pPr>
       <w:pBdr/>
@@ -41580,9 +41573,9 @@
       </w:tcPr>
     </w:tblStylePr>
   </w:style>
-  <w:style w:type="table" w:styleId="129">
+  <w:style w:type="table" w:styleId="849">
     <w:name w:val="Bordered &amp; Lined - Accent 5"/>
-    <w:basedOn w:val="11"/>
+    <w:basedOn w:val="731"/>
     <w:uiPriority w:val="99"/>
     <w:pPr>
       <w:pBdr/>
@@ -41824,9 +41817,9 @@
       </w:tcPr>
     </w:tblStylePr>
   </w:style>
-  <w:style w:type="table" w:styleId="130">
+  <w:style w:type="table" w:styleId="850">
     <w:name w:val="Bordered &amp; Lined - Accent 6"/>
-    <w:basedOn w:val="11"/>
+    <w:basedOn w:val="731"/>
     <w:uiPriority w:val="99"/>
     <w:pPr>
       <w:pBdr/>
@@ -42068,9 +42061,9 @@
       </w:tcPr>
     </w:tblStylePr>
   </w:style>
-  <w:style w:type="table" w:styleId="131">
+  <w:style w:type="table" w:styleId="851">
     <w:name w:val="Bordered"/>
-    <w:basedOn w:val="11"/>
+    <w:basedOn w:val="731"/>
     <w:uiPriority w:val="99"/>
     <w:pPr>
       <w:pBdr/>
@@ -42299,9 +42292,9 @@
       </w:tcPr>
     </w:tblStylePr>
   </w:style>
-  <w:style w:type="table" w:styleId="132">
+  <w:style w:type="table" w:styleId="852">
     <w:name w:val="Bordered - Accent 1"/>
-    <w:basedOn w:val="11"/>
+    <w:basedOn w:val="731"/>
     <w:uiPriority w:val="99"/>
     <w:pPr>
       <w:pBdr/>
@@ -42530,9 +42523,9 @@
       </w:tcPr>
     </w:tblStylePr>
   </w:style>
-  <w:style w:type="table" w:styleId="133">
+  <w:style w:type="table" w:styleId="853">
     <w:name w:val="Bordered - Accent 2"/>
-    <w:basedOn w:val="11"/>
+    <w:basedOn w:val="731"/>
     <w:uiPriority w:val="99"/>
     <w:pPr>
       <w:pBdr/>
@@ -42761,9 +42754,9 @@
       </w:tcPr>
     </w:tblStylePr>
   </w:style>
-  <w:style w:type="table" w:styleId="134">
+  <w:style w:type="table" w:styleId="854">
     <w:name w:val="Bordered - Accent 3"/>
-    <w:basedOn w:val="11"/>
+    <w:basedOn w:val="731"/>
     <w:uiPriority w:val="99"/>
     <w:pPr>
       <w:pBdr/>
@@ -42992,9 +42985,9 @@
       </w:tcPr>
     </w:tblStylePr>
   </w:style>
-  <w:style w:type="table" w:styleId="135">
+  <w:style w:type="table" w:styleId="855">
     <w:name w:val="Bordered - Accent 4"/>
-    <w:basedOn w:val="11"/>
+    <w:basedOn w:val="731"/>
     <w:uiPriority w:val="99"/>
     <w:pPr>
       <w:pBdr/>
@@ -43223,9 +43216,9 @@
       </w:tcPr>
     </w:tblStylePr>
   </w:style>
-  <w:style w:type="table" w:styleId="136">
+  <w:style w:type="table" w:styleId="856">
     <w:name w:val="Bordered - Accent 5"/>
-    <w:basedOn w:val="11"/>
+    <w:basedOn w:val="731"/>
     <w:uiPriority w:val="99"/>
     <w:pPr>
       <w:pBdr/>
@@ -43454,9 +43447,9 @@
       </w:tcPr>
     </w:tblStylePr>
   </w:style>
-  <w:style w:type="table" w:styleId="137">
+  <w:style w:type="table" w:styleId="857">
     <w:name w:val="Bordered - Accent 6"/>
-    <w:basedOn w:val="11"/>
+    <w:basedOn w:val="731"/>
     <w:uiPriority w:val="99"/>
     <w:pPr>
       <w:pBdr/>
@@ -43685,7 +43678,7 @@
       </w:tcPr>
     </w:tblStylePr>
   </w:style>
-  <w:style w:type="paragraph" w:styleId="138" w:default="1">
+  <w:style w:type="paragraph" w:styleId="858" w:default="1">
     <w:name w:val="Normal"/>
     <w:qFormat/>
     <w:pPr>
@@ -43694,11 +43687,11 @@
       <w:ind/>
     </w:pPr>
   </w:style>
-  <w:style w:type="paragraph" w:styleId="145">
+  <w:style w:type="paragraph" w:styleId="859">
     <w:name w:val="Heading 7"/>
-    <w:basedOn w:val="138"/>
-    <w:next w:val="138"/>
-    <w:link w:val="156"/>
+    <w:basedOn w:val="858"/>
+    <w:next w:val="858"/>
+    <w:link w:val="870"/>
     <w:uiPriority w:val="9"/>
     <w:unhideWhenUsed/>
     <w:qFormat/>
@@ -43715,11 +43708,11 @@
       <w:color w:val="595959" w:themeColor="text1" w:themeTint="A6"/>
     </w:rPr>
   </w:style>
-  <w:style w:type="paragraph" w:styleId="146">
+  <w:style w:type="paragraph" w:styleId="860">
     <w:name w:val="Heading 8"/>
-    <w:basedOn w:val="138"/>
-    <w:next w:val="138"/>
-    <w:link w:val="157"/>
+    <w:basedOn w:val="858"/>
+    <w:next w:val="858"/>
+    <w:link w:val="871"/>
     <w:uiPriority w:val="9"/>
     <w:unhideWhenUsed/>
     <w:qFormat/>
@@ -43738,11 +43731,11 @@
       <w:color w:val="272727" w:themeColor="text1" w:themeTint="D8"/>
     </w:rPr>
   </w:style>
-  <w:style w:type="paragraph" w:styleId="147">
+  <w:style w:type="paragraph" w:styleId="861">
     <w:name w:val="Heading 9"/>
-    <w:basedOn w:val="138"/>
-    <w:next w:val="138"/>
-    <w:link w:val="158"/>
+    <w:basedOn w:val="858"/>
+    <w:next w:val="858"/>
+    <w:link w:val="872"/>
     <w:uiPriority w:val="9"/>
     <w:unhideWhenUsed/>
     <w:qFormat/>
@@ -43761,7 +43754,7 @@
       <w:color w:val="272727" w:themeColor="text1" w:themeTint="D8"/>
     </w:rPr>
   </w:style>
-  <w:style w:type="character" w:styleId="148" w:default="1">
+  <w:style w:type="character" w:styleId="862" w:default="1">
     <w:name w:val="Default Paragraph Font"/>
     <w:uiPriority w:val="1"/>
     <w:semiHidden/>
@@ -43772,7 +43765,7 @@
       <w:ind/>
     </w:pPr>
   </w:style>
-  <w:style w:type="numbering" w:styleId="149" w:default="1">
+  <w:style w:type="numbering" w:styleId="863" w:default="1">
     <w:name w:val="No List"/>
     <w:uiPriority w:val="99"/>
     <w:semiHidden/>
@@ -43783,10 +43776,10 @@
       <w:ind/>
     </w:pPr>
   </w:style>
-  <w:style w:type="character" w:styleId="150">
+  <w:style w:type="character" w:styleId="864">
     <w:name w:val="Heading 1 Char"/>
-    <w:basedOn w:val="148"/>
-    <w:link w:val="726"/>
+    <w:basedOn w:val="862"/>
+    <w:link w:val="919"/>
     <w:uiPriority w:val="9"/>
     <w:pPr>
       <w:pBdr/>
@@ -43800,10 +43793,10 @@
       <w:szCs w:val="40"/>
     </w:rPr>
   </w:style>
-  <w:style w:type="character" w:styleId="151">
+  <w:style w:type="character" w:styleId="865">
     <w:name w:val="Heading 2 Char"/>
-    <w:basedOn w:val="148"/>
-    <w:link w:val="727"/>
+    <w:basedOn w:val="862"/>
+    <w:link w:val="920"/>
     <w:uiPriority w:val="9"/>
     <w:pPr>
       <w:pBdr/>
@@ -43817,10 +43810,10 @@
       <w:szCs w:val="32"/>
     </w:rPr>
   </w:style>
-  <w:style w:type="character" w:styleId="152">
+  <w:style w:type="character" w:styleId="866">
     <w:name w:val="Heading 3 Char"/>
-    <w:basedOn w:val="148"/>
-    <w:link w:val="716"/>
+    <w:basedOn w:val="862"/>
+    <w:link w:val="909"/>
     <w:uiPriority w:val="9"/>
     <w:pPr>
       <w:pBdr/>
@@ -43834,10 +43827,10 @@
       <w:szCs w:val="28"/>
     </w:rPr>
   </w:style>
-  <w:style w:type="character" w:styleId="153">
+  <w:style w:type="character" w:styleId="867">
     <w:name w:val="Heading 4 Char"/>
-    <w:basedOn w:val="148"/>
-    <w:link w:val="717"/>
+    <w:basedOn w:val="862"/>
+    <w:link w:val="910"/>
     <w:uiPriority w:val="9"/>
     <w:pPr>
       <w:pBdr/>
@@ -43851,10 +43844,10 @@
       <w:color w:val="0f4761" w:themeColor="accent1" w:themeShade="BF"/>
     </w:rPr>
   </w:style>
-  <w:style w:type="character" w:styleId="154">
+  <w:style w:type="character" w:styleId="868">
     <w:name w:val="Heading 5 Char"/>
-    <w:basedOn w:val="148"/>
-    <w:link w:val="718"/>
+    <w:basedOn w:val="862"/>
+    <w:link w:val="911"/>
     <w:uiPriority w:val="9"/>
     <w:pPr>
       <w:pBdr/>
@@ -43866,10 +43859,10 @@
       <w:color w:val="0f4761" w:themeColor="accent1" w:themeShade="BF"/>
     </w:rPr>
   </w:style>
-  <w:style w:type="character" w:styleId="155">
+  <w:style w:type="character" w:styleId="869">
     <w:name w:val="Heading 6 Char"/>
-    <w:basedOn w:val="148"/>
-    <w:link w:val="719"/>
+    <w:basedOn w:val="862"/>
+    <w:link w:val="912"/>
     <w:uiPriority w:val="9"/>
     <w:pPr>
       <w:pBdr/>
@@ -43883,10 +43876,10 @@
       <w:color w:val="595959" w:themeColor="text1" w:themeTint="A6"/>
     </w:rPr>
   </w:style>
-  <w:style w:type="character" w:styleId="156">
+  <w:style w:type="character" w:styleId="870">
     <w:name w:val="Heading 7 Char"/>
-    <w:basedOn w:val="148"/>
-    <w:link w:val="145"/>
+    <w:basedOn w:val="862"/>
+    <w:link w:val="859"/>
     <w:uiPriority w:val="9"/>
     <w:pPr>
       <w:pBdr/>
@@ -43898,10 +43891,10 @@
       <w:color w:val="595959" w:themeColor="text1" w:themeTint="A6"/>
     </w:rPr>
   </w:style>
-  <w:style w:type="character" w:styleId="157">
+  <w:style w:type="character" w:styleId="871">
     <w:name w:val="Heading 8 Char"/>
-    <w:basedOn w:val="148"/>
-    <w:link w:val="146"/>
+    <w:basedOn w:val="862"/>
+    <w:link w:val="860"/>
     <w:uiPriority w:val="9"/>
     <w:pPr>
       <w:pBdr/>
@@ -43915,10 +43908,10 @@
       <w:color w:val="272727" w:themeColor="text1" w:themeTint="D8"/>
     </w:rPr>
   </w:style>
-  <w:style w:type="character" w:styleId="158">
+  <w:style w:type="character" w:styleId="872">
     <w:name w:val="Heading 9 Char"/>
-    <w:basedOn w:val="148"/>
-    <w:link w:val="147"/>
+    <w:basedOn w:val="862"/>
+    <w:link w:val="861"/>
     <w:uiPriority w:val="9"/>
     <w:pPr>
       <w:pBdr/>
@@ -43932,10 +43925,10 @@
       <w:color w:val="272727" w:themeColor="text1" w:themeTint="D8"/>
     </w:rPr>
   </w:style>
-  <w:style w:type="character" w:styleId="160">
+  <w:style w:type="character" w:styleId="873">
     <w:name w:val="Title Char"/>
-    <w:basedOn w:val="148"/>
-    <w:link w:val="713"/>
+    <w:basedOn w:val="862"/>
+    <w:link w:val="908"/>
     <w:uiPriority w:val="10"/>
     <w:pPr>
       <w:pBdr/>
@@ -43949,11 +43942,11 @@
       <w:szCs w:val="56"/>
     </w:rPr>
   </w:style>
-  <w:style w:type="paragraph" w:styleId="161">
+  <w:style w:type="paragraph" w:styleId="874">
     <w:name w:val="Subtitle"/>
-    <w:basedOn w:val="138"/>
-    <w:next w:val="138"/>
-    <w:link w:val="162"/>
+    <w:basedOn w:val="858"/>
+    <w:next w:val="858"/>
+    <w:link w:val="875"/>
     <w:uiPriority w:val="11"/>
     <w:qFormat/>
     <w:pPr>
@@ -43971,10 +43964,10 @@
       <w:szCs w:val="28"/>
     </w:rPr>
   </w:style>
-  <w:style w:type="character" w:styleId="162">
+  <w:style w:type="character" w:styleId="875">
     <w:name w:val="Subtitle Char"/>
-    <w:basedOn w:val="148"/>
-    <w:link w:val="161"/>
+    <w:basedOn w:val="862"/>
+    <w:link w:val="874"/>
     <w:uiPriority w:val="11"/>
     <w:pPr>
       <w:pBdr/>
@@ -43988,11 +43981,11 @@
       <w:szCs w:val="28"/>
     </w:rPr>
   </w:style>
-  <w:style w:type="paragraph" w:styleId="163">
+  <w:style w:type="paragraph" w:styleId="876">
     <w:name w:val="Quote"/>
-    <w:basedOn w:val="138"/>
-    <w:next w:val="138"/>
-    <w:link w:val="164"/>
+    <w:basedOn w:val="858"/>
+    <w:next w:val="858"/>
+    <w:link w:val="877"/>
     <w:uiPriority w:val="29"/>
     <w:qFormat/>
     <w:pPr>
@@ -44007,10 +44000,10 @@
       <w:color w:val="404040" w:themeColor="text1" w:themeTint="BF"/>
     </w:rPr>
   </w:style>
-  <w:style w:type="character" w:styleId="164">
+  <w:style w:type="character" w:styleId="877">
     <w:name w:val="Quote Char"/>
-    <w:basedOn w:val="148"/>
-    <w:link w:val="163"/>
+    <w:basedOn w:val="862"/>
+    <w:link w:val="876"/>
     <w:uiPriority w:val="29"/>
     <w:pPr>
       <w:pBdr/>
@@ -44023,9 +44016,9 @@
       <w:color w:val="404040" w:themeColor="text1" w:themeTint="BF"/>
     </w:rPr>
   </w:style>
-  <w:style w:type="character" w:styleId="166">
+  <w:style w:type="character" w:styleId="878">
     <w:name w:val="Intense Emphasis"/>
-    <w:basedOn w:val="148"/>
+    <w:basedOn w:val="862"/>
     <w:uiPriority w:val="21"/>
     <w:qFormat/>
     <w:pPr>
@@ -44039,11 +44032,11 @@
       <w:color w:val="0f4761" w:themeColor="accent1" w:themeShade="BF"/>
     </w:rPr>
   </w:style>
-  <w:style w:type="paragraph" w:styleId="167">
+  <w:style w:type="paragraph" w:styleId="879">
     <w:name w:val="Intense Quote"/>
-    <w:basedOn w:val="138"/>
-    <w:next w:val="138"/>
-    <w:link w:val="168"/>
+    <w:basedOn w:val="858"/>
+    <w:next w:val="858"/>
+    <w:link w:val="880"/>
     <w:uiPriority w:val="30"/>
     <w:qFormat/>
     <w:pPr>
@@ -44061,10 +44054,10 @@
       <w:color w:val="0f4761" w:themeColor="accent1" w:themeShade="BF"/>
     </w:rPr>
   </w:style>
-  <w:style w:type="character" w:styleId="168">
+  <w:style w:type="character" w:styleId="880">
     <w:name w:val="Intense Quote Char"/>
-    <w:basedOn w:val="148"/>
-    <w:link w:val="167"/>
+    <w:basedOn w:val="862"/>
+    <w:link w:val="879"/>
     <w:uiPriority w:val="30"/>
     <w:pPr>
       <w:pBdr/>
@@ -44077,9 +44070,9 @@
       <w:color w:val="0f4761" w:themeColor="accent1" w:themeShade="BF"/>
     </w:rPr>
   </w:style>
-  <w:style w:type="character" w:styleId="169">
+  <w:style w:type="character" w:styleId="881">
     <w:name w:val="Intense Reference"/>
-    <w:basedOn w:val="148"/>
+    <w:basedOn w:val="862"/>
     <w:uiPriority w:val="32"/>
     <w:qFormat/>
     <w:pPr>
@@ -44095,9 +44088,9 @@
       <w:spacing w:val="5"/>
     </w:rPr>
   </w:style>
-  <w:style w:type="paragraph" w:styleId="170">
+  <w:style w:type="paragraph" w:styleId="882">
     <w:name w:val="No Spacing"/>
-    <w:basedOn w:val="138"/>
+    <w:basedOn w:val="858"/>
     <w:uiPriority w:val="1"/>
     <w:qFormat/>
     <w:pPr>
@@ -44106,9 +44099,9 @@
       <w:ind/>
     </w:pPr>
   </w:style>
-  <w:style w:type="character" w:styleId="171">
+  <w:style w:type="character" w:styleId="883">
     <w:name w:val="Subtle Emphasis"/>
-    <w:basedOn w:val="148"/>
+    <w:basedOn w:val="862"/>
     <w:uiPriority w:val="19"/>
     <w:qFormat/>
     <w:pPr>
@@ -44122,9 +44115,9 @@
       <w:color w:val="404040" w:themeColor="text1" w:themeTint="BF"/>
     </w:rPr>
   </w:style>
-  <w:style w:type="character" w:styleId="172">
+  <w:style w:type="character" w:styleId="884">
     <w:name w:val="Emphasis"/>
-    <w:basedOn w:val="148"/>
+    <w:basedOn w:val="862"/>
     <w:uiPriority w:val="20"/>
     <w:qFormat/>
     <w:pPr>
@@ -44137,9 +44130,9 @@
       <w:iCs/>
     </w:rPr>
   </w:style>
-  <w:style w:type="character" w:styleId="174">
+  <w:style w:type="character" w:styleId="885">
     <w:name w:val="Subtle Reference"/>
-    <w:basedOn w:val="148"/>
+    <w:basedOn w:val="862"/>
     <w:uiPriority w:val="31"/>
     <w:qFormat/>
     <w:pPr>
@@ -44152,9 +44145,9 @@
       <w:color w:val="5a5a5a" w:themeColor="text1" w:themeTint="A5"/>
     </w:rPr>
   </w:style>
-  <w:style w:type="character" w:styleId="175">
+  <w:style w:type="character" w:styleId="886">
     <w:name w:val="Book Title"/>
-    <w:basedOn w:val="148"/>
+    <w:basedOn w:val="862"/>
     <w:uiPriority w:val="33"/>
     <w:qFormat/>
     <w:pPr>
@@ -44170,10 +44163,10 @@
       <w:spacing w:val="5"/>
     </w:rPr>
   </w:style>
-  <w:style w:type="paragraph" w:styleId="176">
+  <w:style w:type="paragraph" w:styleId="887">
     <w:name w:val="Header"/>
-    <w:basedOn w:val="138"/>
-    <w:link w:val="177"/>
+    <w:basedOn w:val="858"/>
+    <w:link w:val="888"/>
     <w:uiPriority w:val="99"/>
     <w:unhideWhenUsed/>
     <w:pPr>
@@ -44186,10 +44179,10 @@
       <w:ind/>
     </w:pPr>
   </w:style>
-  <w:style w:type="character" w:styleId="177">
+  <w:style w:type="character" w:styleId="888">
     <w:name w:val="Header Char"/>
-    <w:basedOn w:val="148"/>
-    <w:link w:val="176"/>
+    <w:basedOn w:val="862"/>
+    <w:link w:val="887"/>
     <w:uiPriority w:val="99"/>
     <w:pPr>
       <w:pBdr/>
@@ -44197,10 +44190,10 @@
       <w:ind/>
     </w:pPr>
   </w:style>
-  <w:style w:type="paragraph" w:styleId="178">
+  <w:style w:type="paragraph" w:styleId="889">
     <w:name w:val="Footer"/>
-    <w:basedOn w:val="138"/>
-    <w:link w:val="179"/>
+    <w:basedOn w:val="858"/>
+    <w:link w:val="890"/>
     <w:uiPriority w:val="99"/>
     <w:unhideWhenUsed/>
     <w:pPr>
@@ -44213,10 +44206,10 @@
       <w:ind/>
     </w:pPr>
   </w:style>
-  <w:style w:type="character" w:styleId="179">
+  <w:style w:type="character" w:styleId="890">
     <w:name w:val="Footer Char"/>
-    <w:basedOn w:val="148"/>
-    <w:link w:val="178"/>
+    <w:basedOn w:val="862"/>
+    <w:link w:val="889"/>
     <w:uiPriority w:val="99"/>
     <w:pPr>
       <w:pBdr/>
@@ -44224,10 +44217,10 @@
       <w:ind/>
     </w:pPr>
   </w:style>
-  <w:style w:type="paragraph" w:styleId="180">
+  <w:style w:type="paragraph" w:styleId="891">
     <w:name w:val="Caption"/>
-    <w:basedOn w:val="138"/>
-    <w:next w:val="138"/>
+    <w:basedOn w:val="858"/>
+    <w:next w:val="858"/>
     <w:uiPriority w:val="35"/>
     <w:unhideWhenUsed/>
     <w:qFormat/>
@@ -44244,10 +44237,10 @@
       <w:szCs w:val="18"/>
     </w:rPr>
   </w:style>
-  <w:style w:type="paragraph" w:styleId="184">
+  <w:style w:type="paragraph" w:styleId="892">
     <w:name w:val="endnote text"/>
-    <w:basedOn w:val="138"/>
-    <w:link w:val="185"/>
+    <w:basedOn w:val="858"/>
+    <w:link w:val="893"/>
     <w:uiPriority w:val="99"/>
     <w:semiHidden/>
     <w:unhideWhenUsed/>
@@ -44261,10 +44254,10 @@
       <w:szCs w:val="20"/>
     </w:rPr>
   </w:style>
-  <w:style w:type="character" w:styleId="185">
+  <w:style w:type="character" w:styleId="893">
     <w:name w:val="Endnote Text Char"/>
-    <w:basedOn w:val="148"/>
-    <w:link w:val="184"/>
+    <w:basedOn w:val="862"/>
+    <w:link w:val="892"/>
     <w:uiPriority w:val="99"/>
     <w:semiHidden/>
     <w:pPr>
@@ -44277,9 +44270,9 @@
       <w:szCs w:val="20"/>
     </w:rPr>
   </w:style>
-  <w:style w:type="character" w:styleId="186">
+  <w:style w:type="character" w:styleId="894">
     <w:name w:val="endnote reference"/>
-    <w:basedOn w:val="148"/>
+    <w:basedOn w:val="862"/>
     <w:uiPriority w:val="99"/>
     <w:semiHidden/>
     <w:unhideWhenUsed/>
@@ -44292,9 +44285,9 @@
       <w:vertAlign w:val="superscript"/>
     </w:rPr>
   </w:style>
-  <w:style w:type="character" w:styleId="188">
+  <w:style w:type="character" w:styleId="895">
     <w:name w:val="FollowedHyperlink"/>
-    <w:basedOn w:val="148"/>
+    <w:basedOn w:val="862"/>
     <w:uiPriority w:val="99"/>
     <w:semiHidden/>
     <w:unhideWhenUsed/>
@@ -44308,10 +44301,10 @@
       <w:u w:val="single"/>
     </w:rPr>
   </w:style>
-  <w:style w:type="paragraph" w:styleId="189">
+  <w:style w:type="paragraph" w:styleId="896">
     <w:name w:val="toc 1"/>
-    <w:basedOn w:val="138"/>
-    <w:next w:val="138"/>
+    <w:basedOn w:val="858"/>
+    <w:next w:val="858"/>
     <w:uiPriority w:val="39"/>
     <w:unhideWhenUsed/>
     <w:pPr>
@@ -44320,10 +44313,10 @@
       <w:ind/>
     </w:pPr>
   </w:style>
-  <w:style w:type="paragraph" w:styleId="190">
+  <w:style w:type="paragraph" w:styleId="897">
     <w:name w:val="toc 2"/>
-    <w:basedOn w:val="138"/>
-    <w:next w:val="138"/>
+    <w:basedOn w:val="858"/>
+    <w:next w:val="858"/>
     <w:uiPriority w:val="39"/>
     <w:unhideWhenUsed/>
     <w:pPr>
@@ -44332,10 +44325,10 @@
       <w:ind w:left="220"/>
     </w:pPr>
   </w:style>
-  <w:style w:type="paragraph" w:styleId="191">
+  <w:style w:type="paragraph" w:styleId="898">
     <w:name w:val="toc 3"/>
-    <w:basedOn w:val="138"/>
-    <w:next w:val="138"/>
+    <w:basedOn w:val="858"/>
+    <w:next w:val="858"/>
     <w:uiPriority w:val="39"/>
     <w:unhideWhenUsed/>
     <w:pPr>
@@ -44344,10 +44337,10 @@
       <w:ind w:left="440"/>
     </w:pPr>
   </w:style>
-  <w:style w:type="paragraph" w:styleId="192">
+  <w:style w:type="paragraph" w:styleId="899">
     <w:name w:val="toc 4"/>
-    <w:basedOn w:val="138"/>
-    <w:next w:val="138"/>
+    <w:basedOn w:val="858"/>
+    <w:next w:val="858"/>
     <w:uiPriority w:val="39"/>
     <w:unhideWhenUsed/>
     <w:pPr>
@@ -44356,10 +44349,10 @@
       <w:ind w:left="660"/>
     </w:pPr>
   </w:style>
-  <w:style w:type="paragraph" w:styleId="193">
+  <w:style w:type="paragraph" w:styleId="900">
     <w:name w:val="toc 5"/>
-    <w:basedOn w:val="138"/>
-    <w:next w:val="138"/>
+    <w:basedOn w:val="858"/>
+    <w:next w:val="858"/>
     <w:uiPriority w:val="39"/>
     <w:unhideWhenUsed/>
     <w:pPr>
@@ -44368,10 +44361,10 @@
       <w:ind w:left="880"/>
     </w:pPr>
   </w:style>
-  <w:style w:type="paragraph" w:styleId="194">
+  <w:style w:type="paragraph" w:styleId="901">
     <w:name w:val="toc 6"/>
-    <w:basedOn w:val="138"/>
-    <w:next w:val="138"/>
+    <w:basedOn w:val="858"/>
+    <w:next w:val="858"/>
     <w:uiPriority w:val="39"/>
     <w:unhideWhenUsed/>
     <w:pPr>
@@ -44380,10 +44373,10 @@
       <w:ind w:left="1100"/>
     </w:pPr>
   </w:style>
-  <w:style w:type="paragraph" w:styleId="195">
+  <w:style w:type="paragraph" w:styleId="902">
     <w:name w:val="toc 7"/>
-    <w:basedOn w:val="138"/>
-    <w:next w:val="138"/>
+    <w:basedOn w:val="858"/>
+    <w:next w:val="858"/>
     <w:uiPriority w:val="39"/>
     <w:unhideWhenUsed/>
     <w:pPr>
@@ -44392,10 +44385,10 @@
       <w:ind w:left="1320"/>
     </w:pPr>
   </w:style>
-  <w:style w:type="paragraph" w:styleId="196">
+  <w:style w:type="paragraph" w:styleId="903">
     <w:name w:val="toc 8"/>
-    <w:basedOn w:val="138"/>
-    <w:next w:val="138"/>
+    <w:basedOn w:val="858"/>
+    <w:next w:val="858"/>
     <w:uiPriority w:val="39"/>
     <w:unhideWhenUsed/>
     <w:pPr>
@@ -44404,10 +44397,10 @@
       <w:ind w:left="1540"/>
     </w:pPr>
   </w:style>
-  <w:style w:type="paragraph" w:styleId="197">
+  <w:style w:type="paragraph" w:styleId="904">
     <w:name w:val="toc 9"/>
-    <w:basedOn w:val="138"/>
-    <w:next w:val="138"/>
+    <w:basedOn w:val="858"/>
+    <w:next w:val="858"/>
     <w:uiPriority w:val="39"/>
     <w:unhideWhenUsed/>
     <w:pPr>
@@ -44416,9 +44409,9 @@
       <w:ind w:left="1760"/>
     </w:pPr>
   </w:style>
-  <w:style w:type="character" w:styleId="198">
+  <w:style w:type="character" w:styleId="905">
     <w:name w:val="Placeholder Text"/>
-    <w:basedOn w:val="148"/>
+    <w:basedOn w:val="862"/>
     <w:uiPriority w:val="99"/>
     <w:semiHidden/>
     <w:pPr>
@@ -44430,7 +44423,7 @@
       <w:color w:val="666666"/>
     </w:rPr>
   </w:style>
-  <w:style w:type="paragraph" w:styleId="208">
+  <w:style w:type="paragraph" w:styleId="906">
     <w:name w:val="TOC Heading"/>
     <w:uiPriority w:val="39"/>
     <w:unhideWhenUsed/>
@@ -44440,10 +44433,10 @@
       <w:ind/>
     </w:pPr>
   </w:style>
-  <w:style w:type="paragraph" w:styleId="209">
+  <w:style w:type="paragraph" w:styleId="907">
     <w:name w:val="table of figures"/>
-    <w:basedOn w:val="138"/>
-    <w:next w:val="138"/>
+    <w:basedOn w:val="858"/>
+    <w:next w:val="858"/>
     <w:uiPriority w:val="99"/>
     <w:unhideWhenUsed/>
     <w:pPr>
@@ -44452,7 +44445,7 @@
       <w:ind/>
     </w:pPr>
   </w:style>
-  <w:style w:type="paragraph" w:styleId="713">
+  <w:style w:type="paragraph" w:styleId="908">
     <w:name w:val="Title"/>
     <w:qFormat/>
     <w:pPr>
@@ -44465,7 +44458,7 @@
       <w:szCs w:val="56"/>
     </w:rPr>
   </w:style>
-  <w:style w:type="paragraph" w:styleId="716">
+  <w:style w:type="paragraph" w:styleId="909">
     <w:name w:val="Heading 3"/>
     <w:qFormat/>
     <w:pPr>
@@ -44479,7 +44472,7 @@
       <w:szCs w:val="24"/>
     </w:rPr>
   </w:style>
-  <w:style w:type="paragraph" w:styleId="717">
+  <w:style w:type="paragraph" w:styleId="910">
     <w:name w:val="Heading 4"/>
     <w:qFormat/>
     <w:pPr>
@@ -44493,7 +44486,7 @@
       <w:color w:val="2e74b5"/>
     </w:rPr>
   </w:style>
-  <w:style w:type="paragraph" w:styleId="718">
+  <w:style w:type="paragraph" w:styleId="911">
     <w:name w:val="Heading 5"/>
     <w:qFormat/>
     <w:pPr>
@@ -44505,7 +44498,7 @@
       <w:color w:val="2e74b5"/>
     </w:rPr>
   </w:style>
-  <w:style w:type="paragraph" w:styleId="719">
+  <w:style w:type="paragraph" w:styleId="912">
     <w:name w:val="Heading 6"/>
     <w:qFormat/>
     <w:pPr>
@@ -44517,7 +44510,7 @@
       <w:color w:val="1f4d78"/>
     </w:rPr>
   </w:style>
-  <w:style w:type="paragraph" w:styleId="720">
+  <w:style w:type="paragraph" w:styleId="913">
     <w:name w:val="Strong"/>
     <w:qFormat/>
     <w:pPr>
@@ -44530,7 +44523,7 @@
       <w:bCs/>
     </w:rPr>
   </w:style>
-  <w:style w:type="paragraph" w:styleId="721">
+  <w:style w:type="paragraph" w:styleId="914">
     <w:name w:val="List Paragraph"/>
     <w:qFormat/>
     <w:pPr>
@@ -44539,7 +44532,7 @@
       <w:ind/>
     </w:pPr>
   </w:style>
-  <w:style w:type="character" w:styleId="722">
+  <w:style w:type="character" w:styleId="915">
     <w:name w:val="Hyperlink"/>
     <w:uiPriority w:val="99"/>
     <w:unhideWhenUsed/>
@@ -44553,7 +44546,7 @@
       <w:u w:val="single"/>
     </w:rPr>
   </w:style>
-  <w:style w:type="character" w:styleId="723">
+  <w:style w:type="character" w:styleId="916">
     <w:name w:val="footnote reference"/>
     <w:uiPriority w:val="99"/>
     <w:semiHidden/>
@@ -44567,9 +44560,9 @@
       <w:vertAlign w:val="superscript"/>
     </w:rPr>
   </w:style>
-  <w:style w:type="paragraph" w:styleId="724">
+  <w:style w:type="paragraph" w:styleId="917">
     <w:name w:val="footnote text"/>
-    <w:link w:val="725"/>
+    <w:link w:val="918"/>
     <w:uiPriority w:val="99"/>
     <w:semiHidden/>
     <w:unhideWhenUsed/>
@@ -44583,9 +44576,9 @@
       <w:szCs w:val="20"/>
     </w:rPr>
   </w:style>
-  <w:style w:type="character" w:styleId="725">
+  <w:style w:type="character" w:styleId="918">
     <w:name w:val="Footnote Text Char"/>
-    <w:link w:val="724"/>
+    <w:link w:val="917"/>
     <w:uiPriority w:val="99"/>
     <w:semiHidden/>
     <w:unhideWhenUsed/>
@@ -44599,7 +44592,7 @@
       <w:szCs w:val="20"/>
     </w:rPr>
   </w:style>
-  <w:style w:type="paragraph" w:styleId="726">
+  <w:style w:type="paragraph" w:styleId="919">
     <w:name w:val="Heading 1"/>
     <w:qFormat/>
     <w:pPr>
@@ -44617,7 +44610,7 @@
       <w:szCs w:val="28"/>
     </w:rPr>
   </w:style>
-  <w:style w:type="paragraph" w:styleId="727">
+  <w:style w:type="paragraph" w:styleId="920">
     <w:name w:val="Heading 2"/>
     <w:qFormat/>
     <w:pPr>

</xml_diff>